<commit_message>
docs: Updated the following section "The Problem", "Why Local SLM", "Technical Stack Table". It also include version update for changes.
</commit_message>
<xml_diff>
--- a/docs/agent_swarm_at_the_edge_public.docx
+++ b/docs/agent_swarm_at_the_edge_public.docx
@@ -4,53 +4,66 @@
   <w:body>
     <w:p>
       <w:pPr>
-        <w:spacing w:after="100"/>
+        <w:spacing w:after="40"/>
       </w:pPr>
       <w:r>
         <w:rPr>
           <w:b/>
           <w:bCs/>
-          <w:sz w:val="44"/>
-          <w:szCs w:val="44"/>
+          <w:color w:val="2E5B4F"/>
+          <w:sz w:val="40"/>
+          <w:szCs w:val="40"/>
         </w:rPr>
         <w:t xml:space="preserve">Agent Swarm at the Edge</w:t>
       </w:r>
     </w:p>
     <w:p>
       <w:pPr>
-        <w:spacing w:after="60"/>
-      </w:pPr>
-      <w:r>
-        <w:rPr>
-          <w:sz w:val="30"/>
-          <w:szCs w:val="30"/>
+        <w:spacing w:after="120"/>
+      </w:pPr>
+      <w:r>
+        <w:rPr>
+          <w:sz w:val="24"/>
+          <w:szCs w:val="24"/>
         </w:rPr>
         <w:t xml:space="preserve">Architecture Specification</w:t>
       </w:r>
     </w:p>
     <w:p>
       <w:pPr>
-        <w:spacing w:after="100"/>
+        <w:spacing w:after="120"/>
       </w:pPr>
       <w:r>
         <w:rPr>
           <w:i/>
           <w:iCs/>
-        </w:rPr>
-        <w:t xml:space="preserve">Version 0.7: MVP Scoped to L1 System Context Diagram</w:t>
+          <w:sz w:val="21"/>
+          <w:szCs w:val="21"/>
+        </w:rPr>
+        <w:t xml:space="preserve">Version 0.8: MVP Scoped to L1 System Context Diagram</w:t>
+      </w:r>
+    </w:p>
+    <w:p>
+      <w:pPr>
+        <w:spacing w:after="160"/>
+      </w:pPr>
+      <w:r>
+        <w:rPr>
+          <w:color w:val="555555"/>
+          <w:sz w:val="21"/>
+          <w:szCs w:val="21"/>
+        </w:rPr>
+        <w:t xml:space="preserve">14 July 2026 · Max · On-premise / Edge</w:t>
       </w:r>
     </w:p>
     <w:p>
       <w:pPr>
         <w:spacing w:after="200"/>
       </w:pPr>
-      <w:r>
-        <w:t xml:space="preserve">2 July 2026 · Max · On-premise / Edge</w:t>
-      </w:r>
     </w:p>
     <w:tbl>
       <w:tblPr>
-        <w:tblW w:type="dxa" w:w="10200"/>
+        <w:tblW w:type="dxa" w:w="9360"/>
         <w:tblBorders>
           <w:top w:val="single" w:color="auto" w:sz="4"/>
           <w:left w:val="single" w:color="auto" w:sz="4"/>
@@ -61,21 +74,32 @@
         </w:tblBorders>
       </w:tblPr>
       <w:tblGrid>
-        <w:gridCol w:w="3300"/>
-        <w:gridCol w:w="3300"/>
-        <w:gridCol w:w="3600"/>
+        <w:gridCol w:w="3510"/>
+        <w:gridCol w:w="3510"/>
+        <w:gridCol w:w="2340"/>
       </w:tblGrid>
       <w:tr>
-        <w:tc>
-          <w:tcPr>
-            <w:tcW w:type="dxa" w:w="3300"/>
-            <w:shd w:fill="D9D9D9" w:val="clear"/>
+        <w:trPr>
+          <w:tblHeader/>
+        </w:trPr>
+        <w:tc>
+          <w:tcPr>
+            <w:tcW w:type="dxa" w:w="3510"/>
+            <w:shd w:fill="EFEBE2" w:val="clear"/>
+            <w:tcMar>
+              <w:top w:type="dxa" w:w="100"/>
+              <w:left w:type="dxa" w:w="120"/>
+              <w:bottom w:type="dxa" w:w="100"/>
+              <w:right w:type="dxa" w:w="120"/>
+            </w:tcMar>
           </w:tcPr>
           <w:p>
             <w:r>
               <w:rPr>
                 <w:b/>
                 <w:bCs/>
+                <w:sz w:val="20"/>
+                <w:szCs w:val="20"/>
               </w:rPr>
               <w:t xml:space="preserve">Gemma Model (Researcher, Architect, Judge)</w:t>
             </w:r>
@@ -83,14 +107,22 @@
         </w:tc>
         <w:tc>
           <w:tcPr>
-            <w:tcW w:type="dxa" w:w="3300"/>
-            <w:shd w:fill="D9D9D9" w:val="clear"/>
+            <w:tcW w:type="dxa" w:w="3510"/>
+            <w:shd w:fill="EFEBE2" w:val="clear"/>
+            <w:tcMar>
+              <w:top w:type="dxa" w:w="100"/>
+              <w:left w:type="dxa" w:w="120"/>
+              <w:bottom w:type="dxa" w:w="100"/>
+              <w:right w:type="dxa" w:w="120"/>
+            </w:tcMar>
           </w:tcPr>
           <w:p>
             <w:r>
               <w:rPr>
                 <w:b/>
                 <w:bCs/>
+                <w:sz w:val="20"/>
+                <w:szCs w:val="20"/>
               </w:rPr>
               <w:t xml:space="preserve">LFM Model (Scribe, Critic)</w:t>
             </w:r>
@@ -98,14 +130,22 @@
         </w:tc>
         <w:tc>
           <w:tcPr>
-            <w:tcW w:type="dxa" w:w="3600"/>
-            <w:shd w:fill="D9D9D9" w:val="clear"/>
+            <w:tcW w:type="dxa" w:w="2340"/>
+            <w:shd w:fill="EFEBE2" w:val="clear"/>
+            <w:tcMar>
+              <w:top w:type="dxa" w:w="100"/>
+              <w:left w:type="dxa" w:w="120"/>
+              <w:bottom w:type="dxa" w:w="100"/>
+              <w:right w:type="dxa" w:w="120"/>
+            </w:tcMar>
           </w:tcPr>
           <w:p>
             <w:r>
               <w:rPr>
                 <w:b/>
                 <w:bCs/>
+                <w:sz w:val="20"/>
+                <w:szCs w:val="20"/>
               </w:rPr>
               <w:t xml:space="preserve">Inference Engine</w:t>
             </w:r>
@@ -115,30 +155,66 @@
       <w:tr>
         <w:tc>
           <w:tcPr>
-            <w:tcW w:type="dxa" w:w="3300"/>
-          </w:tcPr>
-          <w:p>
-            <w:r>
+            <w:tcW w:type="dxa" w:w="3510"/>
+            <w:tcMar>
+              <w:top w:type="dxa" w:w="100"/>
+              <w:left w:type="dxa" w:w="120"/>
+              <w:bottom w:type="dxa" w:w="100"/>
+              <w:right w:type="dxa" w:w="120"/>
+            </w:tcMar>
+          </w:tcPr>
+          <w:p>
+            <w:r>
+              <w:rPr>
+                <w:b w:val="false"/>
+                <w:bCs w:val="false"/>
+                <w:sz w:val="20"/>
+                <w:szCs w:val="20"/>
+              </w:rPr>
               <w:t xml:space="preserve">unsloth/gemma-4-E4B-it-qat-UD-Q4_K_XL ~2.5 GB RAM · ~14.8 tok/s confirmed</w:t>
             </w:r>
           </w:p>
         </w:tc>
         <w:tc>
           <w:tcPr>
-            <w:tcW w:type="dxa" w:w="3300"/>
-          </w:tcPr>
-          <w:p>
-            <w:r>
+            <w:tcW w:type="dxa" w:w="3510"/>
+            <w:tcMar>
+              <w:top w:type="dxa" w:w="100"/>
+              <w:left w:type="dxa" w:w="120"/>
+              <w:bottom w:type="dxa" w:w="100"/>
+              <w:right w:type="dxa" w:w="120"/>
+            </w:tcMar>
+          </w:tcPr>
+          <w:p>
+            <w:r>
+              <w:rPr>
+                <w:b w:val="false"/>
+                <w:bCs w:val="false"/>
+                <w:sz w:val="20"/>
+                <w:szCs w:val="20"/>
+              </w:rPr>
               <w:t xml:space="preserve">LiquidAI LFM2.5-VL-1.6B Q4_0 ~1.5 GB RAM · ~115 tok/s confirmed</w:t>
             </w:r>
           </w:p>
         </w:tc>
         <w:tc>
           <w:tcPr>
-            <w:tcW w:type="dxa" w:w="3600"/>
-          </w:tcPr>
-          <w:p>
-            <w:r>
+            <w:tcW w:type="dxa" w:w="2340"/>
+            <w:tcMar>
+              <w:top w:type="dxa" w:w="100"/>
+              <w:left w:type="dxa" w:w="120"/>
+              <w:bottom w:type="dxa" w:w="100"/>
+              <w:right w:type="dxa" w:w="120"/>
+            </w:tcMar>
+          </w:tcPr>
+          <w:p>
+            <w:r>
+              <w:rPr>
+                <w:b w:val="false"/>
+                <w:bCs w:val="false"/>
+                <w:sz w:val="20"/>
+                <w:szCs w:val="20"/>
+              </w:rPr>
               <w:t xml:space="preserve">llama-server router mode LRU hot-swap · 2 swaps per run</w:t>
             </w:r>
           </w:p>
@@ -147,65 +223,52 @@
     </w:tbl>
     <w:p>
       <w:pPr>
-        <w:spacing w:after="120"/>
-      </w:pPr>
-      <w:r>
-        <w:rPr>
-          <w:b w:val="false"/>
-          <w:bCs w:val="false"/>
-          <w:i w:val="false"/>
-          <w:iCs w:val="false"/>
-        </w:rPr>
-        <w:t xml:space="preserve"/>
-      </w:r>
-    </w:p>
-    <w:p>
-      <w:pPr>
         <w:pStyle w:val="Heading1"/>
-        <w:spacing w:after="150" w:before="300"/>
-      </w:pPr>
-      <w:r>
+        <w:spacing w:after="160" w:before="400"/>
+      </w:pPr>
+      <w:r>
+        <w:rPr>
+          <w:b/>
+          <w:bCs/>
+          <w:color w:val="2E5B4F"/>
+          <w:sz w:val="30"/>
+          <w:szCs w:val="30"/>
+        </w:rPr>
         <w:t xml:space="preserve">What Is This?</w:t>
       </w:r>
     </w:p>
     <w:p>
       <w:pPr>
-        <w:spacing w:after="120"/>
-      </w:pPr>
-      <w:r>
-        <w:rPr>
-          <w:b w:val="false"/>
-          <w:bCs w:val="false"/>
-          <w:i w:val="false"/>
-          <w:iCs w:val="false"/>
+        <w:spacing w:after="160"/>
+      </w:pPr>
+      <w:r>
+        <w:rPr>
+          <w:sz w:val="21"/>
+          <w:szCs w:val="21"/>
         </w:rPr>
         <w:t xml:space="preserve">Agent Swarm at the Edge is a spec-driven, multi-agent architecture review pipeline that runs entirely on local CPU-only hardware, no cloud, no API keys, no data leaving the device.</w:t>
       </w:r>
     </w:p>
     <w:p>
       <w:pPr>
-        <w:spacing w:after="120"/>
-      </w:pPr>
-      <w:r>
-        <w:rPr>
-          <w:b w:val="false"/>
-          <w:bCs w:val="false"/>
-          <w:i w:val="false"/>
-          <w:iCs w:val="false"/>
+        <w:spacing w:after="160"/>
+      </w:pPr>
+      <w:r>
+        <w:rPr>
+          <w:sz w:val="21"/>
+          <w:szCs w:val="21"/>
         </w:rPr>
         <w:t xml:space="preserve">It automates the discipline of solution architecture for solo developers, small engineering teams, and individual solution architects who know the practice matters but cannot sustain it without tooling support.</w:t>
       </w:r>
     </w:p>
     <w:p>
       <w:pPr>
-        <w:spacing w:after="120"/>
-      </w:pPr>
-      <w:r>
-        <w:rPr>
-          <w:b w:val="false"/>
-          <w:bCs w:val="false"/>
-          <w:i w:val="false"/>
-          <w:iCs w:val="false"/>
+        <w:spacing w:after="160"/>
+      </w:pPr>
+      <w:r>
+        <w:rPr>
+          <w:sz w:val="21"/>
+          <w:szCs w:val="21"/>
         </w:rPr>
         <w:t xml:space="preserve">The output of one pipeline run: a C4 System Context diagram in Mermaid, an Architecture Decision Record triggered by any spec change, a structured gap critique, and a set of scored quality metrics, all requiring human approval before anything is persisted.</w:t>
       </w:r>
@@ -213,60 +276,67 @@
     <w:p>
       <w:pPr>
         <w:pStyle w:val="Heading1"/>
-        <w:spacing w:after="150" w:before="300"/>
-      </w:pPr>
-      <w:r>
+        <w:spacing w:after="160" w:before="400"/>
+      </w:pPr>
+      <w:r>
+        <w:rPr>
+          <w:b/>
+          <w:bCs/>
+          <w:color w:val="2E5B4F"/>
+          <w:sz w:val="30"/>
+          <w:szCs w:val="30"/>
+        </w:rPr>
         <w:t xml:space="preserve">The Problem</w:t>
       </w:r>
     </w:p>
     <w:p>
       <w:pPr>
-        <w:spacing w:after="120"/>
-      </w:pPr>
-      <w:r>
-        <w:rPr>
-          <w:b w:val="false"/>
-          <w:bCs w:val="false"/>
-          <w:i w:val="false"/>
-          <w:iCs w:val="false"/>
+        <w:spacing w:after="160"/>
+      </w:pPr>
+      <w:r>
+        <w:rPr>
+          <w:sz w:val="21"/>
+          <w:szCs w:val="21"/>
         </w:rPr>
         <w:t xml:space="preserve">Most AI tooling today solves for code generation. But software engineering is not only about producing correct code, it also depends on early-stage artifacts that define what should be built, why, and what trade-offs were made.</w:t>
       </w:r>
     </w:p>
     <w:p>
       <w:pPr>
-        <w:spacing w:after="120"/>
-      </w:pPr>
-      <w:r>
-        <w:rPr>
-          <w:b w:val="false"/>
-          <w:bCs w:val="false"/>
-          <w:i w:val="false"/>
-          <w:iCs w:val="false"/>
+        <w:spacing w:after="160"/>
+      </w:pPr>
+      <w:r>
+        <w:rPr>
+          <w:sz w:val="21"/>
+          <w:szCs w:val="21"/>
         </w:rPr>
         <w:t xml:space="preserve">The gap between technical teams and business stakeholders is not new. Business understands capabilities, costs, risks, and decisions. Engineers understand systems, services, and code. Architecture is the translation layer between them, but it is rarely practiced consistently, especially below the enterprise level.</w:t>
       </w:r>
     </w:p>
     <w:p>
       <w:pPr>
-        <w:spacing w:after="120"/>
-      </w:pPr>
-      <w:r>
-        <w:rPr>
-          <w:b w:val="false"/>
-          <w:bCs w:val="false"/>
-          <w:i w:val="false"/>
-          <w:iCs w:val="false"/>
-        </w:rPr>
-        <w:t xml:space="preserve">The C4 model and Architecture Decision Records (ADRs) are the established tools for closing this gap. Most engineers have seen the Simon Brown C4 talk on YouTube. Most know ADRs exist. But there is no forcing function that makes the discipline low-friction enough to sustain, so diagrams go stale, ADRs never get written, and architecture decisions accumulate as undocumented institutional debt.</w:t>
-      </w:r>
-    </w:p>
-    <w:p>
-      <w:pPr>
-        <w:pStyle w:val="Heading2"/>
-        <w:spacing w:after="120" w:before="240"/>
-      </w:pPr>
-      <w:r>
+        <w:spacing w:after="160"/>
+      </w:pPr>
+      <w:r>
+        <w:rPr>
+          <w:sz w:val="21"/>
+          <w:szCs w:val="21"/>
+        </w:rPr>
+        <w:t xml:space="preserve">The C4 model and Architecture Decision Records (ADRs) are the established tools for closing this gap. Both practices are well-evidenced in industry: Spotify, Google, GitHub, and the UK Government Digital Service all use ADRs as standard practice, and Decathlon adopted C4 + ADRs together to break down documentation silos across domains. Most engineers have seen the Simon Brown C4 talk on YouTube. Most know ADRs exist. But there is no forcing function that makes the discipline low-friction enough to sustain, so diagrams go stale, ADRs never get written, and architecture decisions accumulate as undocumented institutional debt.</w:t>
+      </w:r>
+    </w:p>
+    <w:p>
+      <w:pPr>
+        <w:pStyle w:val="Heading3"/>
+        <w:spacing w:after="100" w:before="220"/>
+      </w:pPr>
+      <w:r>
+        <w:rPr>
+          <w:b/>
+          <w:bCs/>
+          <w:sz w:val="24"/>
+          <w:szCs w:val="24"/>
+        </w:rPr>
         <w:t xml:space="preserve">Three Layers This Addresses</w:t>
       </w:r>
     </w:p>
@@ -275,11 +345,15 @@
         <w:pStyle w:val="ListParagraph"/>
         <w:numPr>
           <w:ilvl w:val="0"/>
-          <w:numId w:val="1"/>
+          <w:numId w:val="2"/>
         </w:numPr>
-        <w:spacing w:after="80"/>
-      </w:pPr>
-      <w:r>
+        <w:spacing w:after="100"/>
+      </w:pPr>
+      <w:r>
+        <w:rPr>
+          <w:sz w:val="21"/>
+          <w:szCs w:val="21"/>
+        </w:rPr>
         <w:t xml:space="preserve">The gap: Tech and business have always spoken different languages. C4 + ADRs are the professional bridge, but engineers skip them because they feel like overhead with no immediate payoff.</w:t>
       </w:r>
     </w:p>
@@ -288,11 +362,15 @@
         <w:pStyle w:val="ListParagraph"/>
         <w:numPr>
           <w:ilvl w:val="0"/>
-          <w:numId w:val="1"/>
+          <w:numId w:val="2"/>
         </w:numPr>
-        <w:spacing w:after="80"/>
-      </w:pPr>
-      <w:r>
+        <w:spacing w:after="100"/>
+      </w:pPr>
+      <w:r>
+        <w:rPr>
+          <w:sz w:val="21"/>
+          <w:szCs w:val="21"/>
+        </w:rPr>
         <w:t xml:space="preserve">The lift: AI handles the argument generation: critique, cost analysis, gap detection, diagram production. The engineer focuses on deciding, not documenting. Writing the spec is itself the skill-building.</w:t>
       </w:r>
     </w:p>
@@ -301,29 +379,46 @@
         <w:pStyle w:val="ListParagraph"/>
         <w:numPr>
           <w:ilvl w:val="0"/>
-          <w:numId w:val="1"/>
+          <w:numId w:val="2"/>
         </w:numPr>
-        <w:spacing w:after="80"/>
-      </w:pPr>
-      <w:r>
+        <w:spacing w:after="100"/>
+      </w:pPr>
+      <w:r>
+        <w:rPr>
+          <w:sz w:val="21"/>
+          <w:szCs w:val="21"/>
+        </w:rPr>
         <w:t xml:space="preserve">The trust: On-device SLMs mean sensitive architecture specs never leave the machine. Viable in enterprise, regulated, and air-gapped contexts where cloud LLMs are a non-starter.</w:t>
       </w:r>
     </w:p>
     <w:p>
       <w:pPr>
         <w:pStyle w:val="Heading1"/>
-        <w:spacing w:after="150" w:before="300"/>
-      </w:pPr>
-      <w:r>
+        <w:spacing w:after="160" w:before="400"/>
+      </w:pPr>
+      <w:r>
+        <w:rPr>
+          <w:b/>
+          <w:bCs/>
+          <w:color w:val="2E5B4F"/>
+          <w:sz w:val="30"/>
+          <w:szCs w:val="30"/>
+        </w:rPr>
         <w:t xml:space="preserve">Who It Is For</w:t>
       </w:r>
     </w:p>
     <w:p>
       <w:pPr>
         <w:pStyle w:val="Heading3"/>
-        <w:spacing w:after="100" w:before="200"/>
-      </w:pPr>
-      <w:r>
+        <w:spacing w:after="100" w:before="220"/>
+      </w:pPr>
+      <w:r>
+        <w:rPr>
+          <w:b/>
+          <w:bCs/>
+          <w:sz w:val="24"/>
+          <w:szCs w:val="24"/>
+        </w:rPr>
         <w:t xml:space="preserve">Primary Users</w:t>
       </w:r>
     </w:p>
@@ -332,11 +427,15 @@
         <w:pStyle w:val="ListParagraph"/>
         <w:numPr>
           <w:ilvl w:val="0"/>
-          <w:numId w:val="1"/>
+          <w:numId w:val="2"/>
         </w:numPr>
-        <w:spacing w:after="80"/>
-      </w:pPr>
-      <w:r>
+        <w:spacing w:after="100"/>
+      </w:pPr>
+      <w:r>
+        <w:rPr>
+          <w:sz w:val="21"/>
+          <w:szCs w:val="21"/>
+        </w:rPr>
         <w:t xml:space="preserve">Solo developers building real systems who want to think at architecture level but have no peer reviewer to challenge their design.</w:t>
       </w:r>
     </w:p>
@@ -345,11 +444,15 @@
         <w:pStyle w:val="ListParagraph"/>
         <w:numPr>
           <w:ilvl w:val="0"/>
-          <w:numId w:val="1"/>
+          <w:numId w:val="2"/>
         </w:numPr>
-        <w:spacing w:after="80"/>
-      </w:pPr>
-      <w:r>
+        <w:spacing w:after="100"/>
+      </w:pPr>
+      <w:r>
+        <w:rPr>
+          <w:sz w:val="21"/>
+          <w:szCs w:val="21"/>
+        </w:rPr>
         <w:t xml:space="preserve">Small teams (2–5 engineers) making architecture decisions in Slack threads that disappear, leaving new joiners with no context on why anything was built the way it was.</w:t>
       </w:r>
     </w:p>
@@ -358,20 +461,30 @@
         <w:pStyle w:val="ListParagraph"/>
         <w:numPr>
           <w:ilvl w:val="0"/>
-          <w:numId w:val="1"/>
+          <w:numId w:val="2"/>
         </w:numPr>
-        <w:spacing w:after="80"/>
-      </w:pPr>
-      <w:r>
+        <w:spacing w:after="100"/>
+      </w:pPr>
+      <w:r>
+        <w:rPr>
+          <w:sz w:val="21"/>
+          <w:szCs w:val="21"/>
+        </w:rPr>
         <w:t xml:space="preserve">Individual solution architects who need to produce defensible, professional architecture artifacts quickly and privately across multiple clients or projects.</w:t>
       </w:r>
     </w:p>
     <w:p>
       <w:pPr>
         <w:pStyle w:val="Heading3"/>
-        <w:spacing w:after="100" w:before="200"/>
-      </w:pPr>
-      <w:r>
+        <w:spacing w:after="100" w:before="220"/>
+      </w:pPr>
+      <w:r>
+        <w:rPr>
+          <w:b/>
+          <w:bCs/>
+          <w:sz w:val="24"/>
+          <w:szCs w:val="24"/>
+        </w:rPr>
         <w:t xml:space="preserve">Secondary Users</w:t>
       </w:r>
     </w:p>
@@ -380,11 +493,15 @@
         <w:pStyle w:val="ListParagraph"/>
         <w:numPr>
           <w:ilvl w:val="0"/>
-          <w:numId w:val="1"/>
+          <w:numId w:val="2"/>
         </w:numPr>
-        <w:spacing w:after="80"/>
-      </w:pPr>
-      <w:r>
+        <w:spacing w:after="100"/>
+      </w:pPr>
+      <w:r>
+        <w:rPr>
+          <w:sz w:val="21"/>
+          <w:szCs w:val="21"/>
+        </w:rPr>
         <w:t xml:space="preserve">Business stakeholders and non-technical leads who need to understand architecture decisions without reading code. The C4 System Context diagram is designed for this audience.</w:t>
       </w:r>
     </w:p>
@@ -393,68 +510,73 @@
         <w:pStyle w:val="ListParagraph"/>
         <w:numPr>
           <w:ilvl w:val="0"/>
-          <w:numId w:val="1"/>
+          <w:numId w:val="2"/>
         </w:numPr>
-        <w:spacing w:after="80"/>
-      </w:pPr>
-      <w:r>
+        <w:spacing w:after="100"/>
+      </w:pPr>
+      <w:r>
+        <w:rPr>
+          <w:sz w:val="21"/>
+          <w:szCs w:val="21"/>
+        </w:rPr>
         <w:t xml:space="preserve">Engineers leveling up toward solution architect roles who need to internalize C4 + ADR discipline through practice, not just YouTube talks.</w:t>
       </w:r>
     </w:p>
     <w:p>
       <w:pPr>
         <w:pStyle w:val="Heading1"/>
-        <w:spacing w:after="150" w:before="300"/>
-      </w:pPr>
-      <w:r>
+        <w:spacing w:after="160" w:before="400"/>
+      </w:pPr>
+      <w:r>
+        <w:rPr>
+          <w:b/>
+          <w:bCs/>
+          <w:color w:val="2E5B4F"/>
+          <w:sz w:val="30"/>
+          <w:szCs w:val="30"/>
+        </w:rPr>
         <w:t xml:space="preserve">Why Local SLMs?</w:t>
       </w:r>
     </w:p>
     <w:p>
       <w:pPr>
-        <w:spacing w:after="120"/>
-      </w:pPr>
-      <w:r>
-        <w:rPr>
-          <w:b w:val="false"/>
-          <w:bCs w:val="false"/>
-          <w:i w:val="false"/>
-          <w:iCs w:val="false"/>
+        <w:spacing w:after="160"/>
+      </w:pPr>
+      <w:r>
+        <w:rPr>
+          <w:sz w:val="21"/>
+          <w:szCs w:val="21"/>
         </w:rPr>
         <w:t xml:space="preserve">Architecture specifications contain sensitive system design, infrastructure topology, and cost assumptions. These should not leave the device.</w:t>
       </w:r>
     </w:p>
     <w:p>
       <w:pPr>
-        <w:spacing w:after="120"/>
-      </w:pPr>
-      <w:r>
-        <w:rPr>
-          <w:b w:val="false"/>
-          <w:bCs w:val="false"/>
-          <w:i w:val="false"/>
-          <w:iCs w:val="false"/>
+        <w:spacing w:after="160"/>
+      </w:pPr>
+      <w:r>
+        <w:rPr>
+          <w:sz w:val="21"/>
+          <w:szCs w:val="21"/>
         </w:rPr>
         <w:t xml:space="preserve">Running on CPU-only edge hardware means any engineer working in an air-gapped corporate environment, a regulated industry, a resource-constrained startup, or simply someone who values privacy can use this tool without cloud dependencies, API keys, or data egress.</w:t>
       </w:r>
     </w:p>
     <w:p>
       <w:pPr>
-        <w:spacing w:after="120"/>
-      </w:pPr>
-      <w:r>
-        <w:rPr>
-          <w:b w:val="false"/>
-          <w:bCs w:val="false"/>
-          <w:i w:val="false"/>
-          <w:iCs w:val="false"/>
-        </w:rPr>
-        <w:t xml:space="preserve">The sequential pipeline design is a direct response to hardware constraints: one agent at a time, thermal management between steps, model hot-swap via LRU eviction. On more capable hardware, agents would run concurrently. The constraint shapes the architecture, which is itself an honest demonstration of the tool's purpose.</w:t>
+        <w:spacing w:after="160"/>
+      </w:pPr>
+      <w:r>
+        <w:rPr>
+          <w:sz w:val="21"/>
+          <w:szCs w:val="21"/>
+        </w:rPr>
+        <w:t xml:space="preserve">The pipeline runs one agent at a time. That is partly a hardware constraint (thermal management and RAM headroom on a single CPU) and partly a design constraint (each agent depends on the previous agent's output on the blackboard, so the order would hold even on more capable hardware). Keeping those two causes distinct, rather than presenting the sequencing as purely a hardware limitation, is itself an honest demonstration of the tool's purpose.</w:t>
       </w:r>
     </w:p>
     <w:tbl>
       <w:tblPr>
-        <w:tblW w:type="dxa" w:w="9000"/>
+        <w:tblW w:type="dxa" w:w="9360"/>
         <w:tblBorders>
           <w:top w:val="single" w:color="auto" w:sz="4"/>
           <w:left w:val="single" w:color="auto" w:sz="4"/>
@@ -465,20 +587,31 @@
         </w:tblBorders>
       </w:tblPr>
       <w:tblGrid>
-        <w:gridCol w:w="2500"/>
-        <w:gridCol w:w="6500"/>
+        <w:gridCol w:w="3120"/>
+        <w:gridCol w:w="6240"/>
       </w:tblGrid>
       <w:tr>
-        <w:tc>
-          <w:tcPr>
-            <w:tcW w:type="dxa" w:w="2500"/>
-            <w:shd w:fill="D9D9D9" w:val="clear"/>
+        <w:trPr>
+          <w:tblHeader/>
+        </w:trPr>
+        <w:tc>
+          <w:tcPr>
+            <w:tcW w:type="dxa" w:w="3120"/>
+            <w:shd w:fill="EFEBE2" w:val="clear"/>
+            <w:tcMar>
+              <w:top w:type="dxa" w:w="100"/>
+              <w:left w:type="dxa" w:w="120"/>
+              <w:bottom w:type="dxa" w:w="100"/>
+              <w:right w:type="dxa" w:w="120"/>
+            </w:tcMar>
           </w:tcPr>
           <w:p>
             <w:r>
               <w:rPr>
                 <w:b/>
                 <w:bCs/>
+                <w:sz w:val="20"/>
+                <w:szCs w:val="20"/>
               </w:rPr>
               <w:t xml:space="preserve">Hardware</w:t>
             </w:r>
@@ -486,14 +619,22 @@
         </w:tc>
         <w:tc>
           <w:tcPr>
-            <w:tcW w:type="dxa" w:w="6500"/>
-            <w:shd w:fill="D9D9D9" w:val="clear"/>
+            <w:tcW w:type="dxa" w:w="6240"/>
+            <w:shd w:fill="EFEBE2" w:val="clear"/>
+            <w:tcMar>
+              <w:top w:type="dxa" w:w="100"/>
+              <w:left w:type="dxa" w:w="120"/>
+              <w:bottom w:type="dxa" w:w="100"/>
+              <w:right w:type="dxa" w:w="120"/>
+            </w:tcMar>
           </w:tcPr>
           <w:p>
             <w:r>
               <w:rPr>
                 <w:b/>
                 <w:bCs/>
+                <w:sz w:val="20"/>
+                <w:szCs w:val="20"/>
               </w:rPr>
               <w:t xml:space="preserve">Detail</w:t>
             </w:r>
@@ -503,20 +644,44 @@
       <w:tr>
         <w:tc>
           <w:tcPr>
-            <w:tcW w:type="dxa" w:w="2500"/>
-          </w:tcPr>
-          <w:p>
-            <w:r>
+            <w:tcW w:type="dxa" w:w="3120"/>
+            <w:tcMar>
+              <w:top w:type="dxa" w:w="100"/>
+              <w:left w:type="dxa" w:w="120"/>
+              <w:bottom w:type="dxa" w:w="100"/>
+              <w:right w:type="dxa" w:w="120"/>
+            </w:tcMar>
+          </w:tcPr>
+          <w:p>
+            <w:r>
+              <w:rPr>
+                <w:b w:val="false"/>
+                <w:bCs w:val="false"/>
+                <w:sz w:val="20"/>
+                <w:szCs w:val="20"/>
+              </w:rPr>
               <w:t xml:space="preserve">Device</w:t>
             </w:r>
           </w:p>
         </w:tc>
         <w:tc>
           <w:tcPr>
-            <w:tcW w:type="dxa" w:w="6500"/>
-          </w:tcPr>
-          <w:p>
-            <w:r>
+            <w:tcW w:type="dxa" w:w="6240"/>
+            <w:tcMar>
+              <w:top w:type="dxa" w:w="100"/>
+              <w:left w:type="dxa" w:w="120"/>
+              <w:bottom w:type="dxa" w:w="100"/>
+              <w:right w:type="dxa" w:w="120"/>
+            </w:tcMar>
+          </w:tcPr>
+          <w:p>
+            <w:r>
+              <w:rPr>
+                <w:b w:val="false"/>
+                <w:bCs w:val="false"/>
+                <w:sz w:val="20"/>
+                <w:szCs w:val="20"/>
+              </w:rPr>
               <w:t xml:space="preserve">ASUS ZenBook UX325EA</w:t>
             </w:r>
           </w:p>
@@ -525,20 +690,44 @@
       <w:tr>
         <w:tc>
           <w:tcPr>
-            <w:tcW w:type="dxa" w:w="2500"/>
-          </w:tcPr>
-          <w:p>
-            <w:r>
+            <w:tcW w:type="dxa" w:w="3120"/>
+            <w:tcMar>
+              <w:top w:type="dxa" w:w="100"/>
+              <w:left w:type="dxa" w:w="120"/>
+              <w:bottom w:type="dxa" w:w="100"/>
+              <w:right w:type="dxa" w:w="120"/>
+            </w:tcMar>
+          </w:tcPr>
+          <w:p>
+            <w:r>
+              <w:rPr>
+                <w:b w:val="false"/>
+                <w:bCs w:val="false"/>
+                <w:sz w:val="20"/>
+                <w:szCs w:val="20"/>
+              </w:rPr>
               <w:t xml:space="preserve">CPU</w:t>
             </w:r>
           </w:p>
         </w:tc>
         <w:tc>
           <w:tcPr>
-            <w:tcW w:type="dxa" w:w="6500"/>
-          </w:tcPr>
-          <w:p>
-            <w:r>
+            <w:tcW w:type="dxa" w:w="6240"/>
+            <w:tcMar>
+              <w:top w:type="dxa" w:w="100"/>
+              <w:left w:type="dxa" w:w="120"/>
+              <w:bottom w:type="dxa" w:w="100"/>
+              <w:right w:type="dxa" w:w="120"/>
+            </w:tcMar>
+          </w:tcPr>
+          <w:p>
+            <w:r>
+              <w:rPr>
+                <w:b w:val="false"/>
+                <w:bCs w:val="false"/>
+                <w:sz w:val="20"/>
+                <w:szCs w:val="20"/>
+              </w:rPr>
               <w:t xml:space="preserve">Intel Core i5-1135G7 (4 threads, powersave governor)</w:t>
             </w:r>
           </w:p>
@@ -547,20 +736,44 @@
       <w:tr>
         <w:tc>
           <w:tcPr>
-            <w:tcW w:type="dxa" w:w="2500"/>
-          </w:tcPr>
-          <w:p>
-            <w:r>
+            <w:tcW w:type="dxa" w:w="3120"/>
+            <w:tcMar>
+              <w:top w:type="dxa" w:w="100"/>
+              <w:left w:type="dxa" w:w="120"/>
+              <w:bottom w:type="dxa" w:w="100"/>
+              <w:right w:type="dxa" w:w="120"/>
+            </w:tcMar>
+          </w:tcPr>
+          <w:p>
+            <w:r>
+              <w:rPr>
+                <w:b w:val="false"/>
+                <w:bCs w:val="false"/>
+                <w:sz w:val="20"/>
+                <w:szCs w:val="20"/>
+              </w:rPr>
               <w:t xml:space="preserve">RAM</w:t>
             </w:r>
           </w:p>
         </w:tc>
         <w:tc>
           <w:tcPr>
-            <w:tcW w:type="dxa" w:w="6500"/>
-          </w:tcPr>
-          <w:p>
-            <w:r>
+            <w:tcW w:type="dxa" w:w="6240"/>
+            <w:tcMar>
+              <w:top w:type="dxa" w:w="100"/>
+              <w:left w:type="dxa" w:w="120"/>
+              <w:bottom w:type="dxa" w:w="100"/>
+              <w:right w:type="dxa" w:w="120"/>
+            </w:tcMar>
+          </w:tcPr>
+          <w:p>
+            <w:r>
+              <w:rPr>
+                <w:b w:val="false"/>
+                <w:bCs w:val="false"/>
+                <w:sz w:val="20"/>
+                <w:szCs w:val="20"/>
+              </w:rPr>
               <w:t xml:space="preserve">16 GB total · ~7–8 GB available for workloads</w:t>
             </w:r>
           </w:p>
@@ -569,20 +782,44 @@
       <w:tr>
         <w:tc>
           <w:tcPr>
-            <w:tcW w:type="dxa" w:w="2500"/>
-          </w:tcPr>
-          <w:p>
-            <w:r>
+            <w:tcW w:type="dxa" w:w="3120"/>
+            <w:tcMar>
+              <w:top w:type="dxa" w:w="100"/>
+              <w:left w:type="dxa" w:w="120"/>
+              <w:bottom w:type="dxa" w:w="100"/>
+              <w:right w:type="dxa" w:w="120"/>
+            </w:tcMar>
+          </w:tcPr>
+          <w:p>
+            <w:r>
+              <w:rPr>
+                <w:b w:val="false"/>
+                <w:bCs w:val="false"/>
+                <w:sz w:val="20"/>
+                <w:szCs w:val="20"/>
+              </w:rPr>
               <w:t xml:space="preserve">GPU</w:t>
             </w:r>
           </w:p>
         </w:tc>
         <w:tc>
           <w:tcPr>
-            <w:tcW w:type="dxa" w:w="6500"/>
-          </w:tcPr>
-          <w:p>
-            <w:r>
+            <w:tcW w:type="dxa" w:w="6240"/>
+            <w:tcMar>
+              <w:top w:type="dxa" w:w="100"/>
+              <w:left w:type="dxa" w:w="120"/>
+              <w:bottom w:type="dxa" w:w="100"/>
+              <w:right w:type="dxa" w:w="120"/>
+            </w:tcMar>
+          </w:tcPr>
+          <w:p>
+            <w:r>
+              <w:rPr>
+                <w:b w:val="false"/>
+                <w:bCs w:val="false"/>
+                <w:sz w:val="20"/>
+                <w:szCs w:val="20"/>
+              </w:rPr>
               <w:t xml:space="preserve">Intel Iris Xe iGPU, no discrete GPU, CPU-only inference</w:t>
             </w:r>
           </w:p>
@@ -591,20 +828,44 @@
       <w:tr>
         <w:tc>
           <w:tcPr>
-            <w:tcW w:type="dxa" w:w="2500"/>
-          </w:tcPr>
-          <w:p>
-            <w:r>
+            <w:tcW w:type="dxa" w:w="3120"/>
+            <w:tcMar>
+              <w:top w:type="dxa" w:w="100"/>
+              <w:left w:type="dxa" w:w="120"/>
+              <w:bottom w:type="dxa" w:w="100"/>
+              <w:right w:type="dxa" w:w="120"/>
+            </w:tcMar>
+          </w:tcPr>
+          <w:p>
+            <w:r>
+              <w:rPr>
+                <w:b w:val="false"/>
+                <w:bCs w:val="false"/>
+                <w:sz w:val="20"/>
+                <w:szCs w:val="20"/>
+              </w:rPr>
               <w:t xml:space="preserve">OS</w:t>
             </w:r>
           </w:p>
         </w:tc>
         <w:tc>
           <w:tcPr>
-            <w:tcW w:type="dxa" w:w="6500"/>
-          </w:tcPr>
-          <w:p>
-            <w:r>
+            <w:tcW w:type="dxa" w:w="6240"/>
+            <w:tcMar>
+              <w:top w:type="dxa" w:w="100"/>
+              <w:left w:type="dxa" w:w="120"/>
+              <w:bottom w:type="dxa" w:w="100"/>
+              <w:right w:type="dxa" w:w="120"/>
+            </w:tcMar>
+          </w:tcPr>
+          <w:p>
+            <w:r>
+              <w:rPr>
+                <w:b w:val="false"/>
+                <w:bCs w:val="false"/>
+                <w:sz w:val="20"/>
+                <w:szCs w:val="20"/>
+              </w:rPr>
               <w:t xml:space="preserve">Ubuntu 26.04 LTS "resolute"</w:t>
             </w:r>
           </w:p>
@@ -614,29 +875,34 @@
     <w:p>
       <w:pPr>
         <w:pStyle w:val="Heading1"/>
-        <w:spacing w:after="150" w:before="300"/>
-      </w:pPr>
-      <w:r>
+        <w:spacing w:after="160" w:before="400"/>
+      </w:pPr>
+      <w:r>
+        <w:rPr>
+          <w:b/>
+          <w:bCs/>
+          <w:color w:val="2E5B4F"/>
+          <w:sz w:val="30"/>
+          <w:szCs w:val="30"/>
+        </w:rPr>
         <w:t xml:space="preserve">The Pipeline</w:t>
       </w:r>
     </w:p>
     <w:p>
       <w:pPr>
-        <w:spacing w:after="120"/>
-      </w:pPr>
-      <w:r>
-        <w:rPr>
-          <w:b w:val="false"/>
-          <w:bCs w:val="false"/>
-          <w:i w:val="false"/>
-          <w:iCs w:val="false"/>
+        <w:spacing w:after="160"/>
+      </w:pPr>
+      <w:r>
+        <w:rPr>
+          <w:sz w:val="21"/>
+          <w:szCs w:val="21"/>
         </w:rPr>
         <w:t xml:space="preserve">Five agents run sequentially. Two models are used, grouped to minimise hot-swap overhead to two swaps per run.</w:t>
       </w:r>
     </w:p>
     <w:tbl>
       <w:tblPr>
-        <w:tblW w:type="dxa" w:w="9000"/>
+        <w:tblW w:type="dxa" w:w="9360"/>
         <w:tblBorders>
           <w:top w:val="single" w:color="auto" w:sz="4"/>
           <w:left w:val="single" w:color="auto" w:sz="4"/>
@@ -647,21 +913,32 @@
         </w:tblBorders>
       </w:tblPr>
       <w:tblGrid>
-        <w:gridCol w:w="1800"/>
-        <w:gridCol w:w="2800"/>
-        <w:gridCol w:w="4400"/>
+        <w:gridCol w:w="2340"/>
+        <w:gridCol w:w="2340"/>
+        <w:gridCol w:w="4680"/>
       </w:tblGrid>
       <w:tr>
-        <w:tc>
-          <w:tcPr>
-            <w:tcW w:type="dxa" w:w="1800"/>
-            <w:shd w:fill="D9D9D9" w:val="clear"/>
+        <w:trPr>
+          <w:tblHeader/>
+        </w:trPr>
+        <w:tc>
+          <w:tcPr>
+            <w:tcW w:type="dxa" w:w="2340"/>
+            <w:shd w:fill="EFEBE2" w:val="clear"/>
+            <w:tcMar>
+              <w:top w:type="dxa" w:w="100"/>
+              <w:left w:type="dxa" w:w="120"/>
+              <w:bottom w:type="dxa" w:w="100"/>
+              <w:right w:type="dxa" w:w="120"/>
+            </w:tcMar>
           </w:tcPr>
           <w:p>
             <w:r>
               <w:rPr>
                 <w:b/>
                 <w:bCs/>
+                <w:sz w:val="20"/>
+                <w:szCs w:val="20"/>
               </w:rPr>
               <w:t xml:space="preserve">Agent</w:t>
             </w:r>
@@ -669,14 +946,22 @@
         </w:tc>
         <w:tc>
           <w:tcPr>
-            <w:tcW w:type="dxa" w:w="2800"/>
-            <w:shd w:fill="D9D9D9" w:val="clear"/>
+            <w:tcW w:type="dxa" w:w="2340"/>
+            <w:shd w:fill="EFEBE2" w:val="clear"/>
+            <w:tcMar>
+              <w:top w:type="dxa" w:w="100"/>
+              <w:left w:type="dxa" w:w="120"/>
+              <w:bottom w:type="dxa" w:w="100"/>
+              <w:right w:type="dxa" w:w="120"/>
+            </w:tcMar>
           </w:tcPr>
           <w:p>
             <w:r>
               <w:rPr>
                 <w:b/>
                 <w:bCs/>
+                <w:sz w:val="20"/>
+                <w:szCs w:val="20"/>
               </w:rPr>
               <w:t xml:space="preserve">Model</w:t>
             </w:r>
@@ -684,14 +969,22 @@
         </w:tc>
         <w:tc>
           <w:tcPr>
-            <w:tcW w:type="dxa" w:w="4400"/>
-            <w:shd w:fill="D9D9D9" w:val="clear"/>
+            <w:tcW w:type="dxa" w:w="4680"/>
+            <w:shd w:fill="EFEBE2" w:val="clear"/>
+            <w:tcMar>
+              <w:top w:type="dxa" w:w="100"/>
+              <w:left w:type="dxa" w:w="120"/>
+              <w:bottom w:type="dxa" w:w="100"/>
+              <w:right w:type="dxa" w:w="120"/>
+            </w:tcMar>
           </w:tcPr>
           <w:p>
             <w:r>
               <w:rPr>
                 <w:b/>
                 <w:bCs/>
+                <w:sz w:val="20"/>
+                <w:szCs w:val="20"/>
               </w:rPr>
               <w:t xml:space="preserve">Role</w:t>
             </w:r>
@@ -701,30 +994,66 @@
       <w:tr>
         <w:tc>
           <w:tcPr>
-            <w:tcW w:type="dxa" w:w="1800"/>
-          </w:tcPr>
-          <w:p>
-            <w:r>
+            <w:tcW w:type="dxa" w:w="2340"/>
+            <w:tcMar>
+              <w:top w:type="dxa" w:w="100"/>
+              <w:left w:type="dxa" w:w="120"/>
+              <w:bottom w:type="dxa" w:w="100"/>
+              <w:right w:type="dxa" w:w="120"/>
+            </w:tcMar>
+          </w:tcPr>
+          <w:p>
+            <w:r>
+              <w:rPr>
+                <w:b w:val="false"/>
+                <w:bCs w:val="false"/>
+                <w:sz w:val="20"/>
+                <w:szCs w:val="20"/>
+              </w:rPr>
               <w:t xml:space="preserve">Researcher</w:t>
             </w:r>
           </w:p>
         </w:tc>
         <w:tc>
           <w:tcPr>
-            <w:tcW w:type="dxa" w:w="2800"/>
-          </w:tcPr>
-          <w:p>
-            <w:r>
+            <w:tcW w:type="dxa" w:w="2340"/>
+            <w:tcMar>
+              <w:top w:type="dxa" w:w="100"/>
+              <w:left w:type="dxa" w:w="120"/>
+              <w:bottom w:type="dxa" w:w="100"/>
+              <w:right w:type="dxa" w:w="120"/>
+            </w:tcMar>
+          </w:tcPr>
+          <w:p>
+            <w:r>
+              <w:rPr>
+                <w:b w:val="false"/>
+                <w:bCs w:val="false"/>
+                <w:sz w:val="20"/>
+                <w:szCs w:val="20"/>
+              </w:rPr>
               <w:t xml:space="preserve">Gemma 4 E4B QAT</w:t>
             </w:r>
           </w:p>
         </w:tc>
         <w:tc>
           <w:tcPr>
-            <w:tcW w:type="dxa" w:w="4400"/>
-          </w:tcPr>
-          <w:p>
-            <w:r>
+            <w:tcW w:type="dxa" w:w="4680"/>
+            <w:tcMar>
+              <w:top w:type="dxa" w:w="100"/>
+              <w:left w:type="dxa" w:w="120"/>
+              <w:bottom w:type="dxa" w:w="100"/>
+              <w:right w:type="dxa" w:w="120"/>
+            </w:tcMar>
+          </w:tcPr>
+          <w:p>
+            <w:r>
+              <w:rPr>
+                <w:b w:val="false"/>
+                <w:bCs w:val="false"/>
+                <w:sz w:val="20"/>
+                <w:szCs w:val="20"/>
+              </w:rPr>
               <w:t xml:space="preserve">Enriches the blackboard with context and Infracost cloud pricing data via tool call.</w:t>
             </w:r>
           </w:p>
@@ -733,30 +1062,66 @@
       <w:tr>
         <w:tc>
           <w:tcPr>
-            <w:tcW w:type="dxa" w:w="1800"/>
-          </w:tcPr>
-          <w:p>
-            <w:r>
+            <w:tcW w:type="dxa" w:w="2340"/>
+            <w:tcMar>
+              <w:top w:type="dxa" w:w="100"/>
+              <w:left w:type="dxa" w:w="120"/>
+              <w:bottom w:type="dxa" w:w="100"/>
+              <w:right w:type="dxa" w:w="120"/>
+            </w:tcMar>
+          </w:tcPr>
+          <w:p>
+            <w:r>
+              <w:rPr>
+                <w:b w:val="false"/>
+                <w:bCs w:val="false"/>
+                <w:sz w:val="20"/>
+                <w:szCs w:val="20"/>
+              </w:rPr>
               <w:t xml:space="preserve">Architect</w:t>
             </w:r>
           </w:p>
         </w:tc>
         <w:tc>
           <w:tcPr>
-            <w:tcW w:type="dxa" w:w="2800"/>
-          </w:tcPr>
-          <w:p>
-            <w:r>
+            <w:tcW w:type="dxa" w:w="2340"/>
+            <w:tcMar>
+              <w:top w:type="dxa" w:w="100"/>
+              <w:left w:type="dxa" w:w="120"/>
+              <w:bottom w:type="dxa" w:w="100"/>
+              <w:right w:type="dxa" w:w="120"/>
+            </w:tcMar>
+          </w:tcPr>
+          <w:p>
+            <w:r>
+              <w:rPr>
+                <w:b w:val="false"/>
+                <w:bCs w:val="false"/>
+                <w:sz w:val="20"/>
+                <w:szCs w:val="20"/>
+              </w:rPr>
               <w:t xml:space="preserve">Gemma 4 E4B QAT</w:t>
             </w:r>
           </w:p>
         </w:tc>
         <w:tc>
           <w:tcPr>
-            <w:tcW w:type="dxa" w:w="4400"/>
-          </w:tcPr>
-          <w:p>
-            <w:r>
+            <w:tcW w:type="dxa" w:w="4680"/>
+            <w:tcMar>
+              <w:top w:type="dxa" w:w="100"/>
+              <w:left w:type="dxa" w:w="120"/>
+              <w:bottom w:type="dxa" w:w="100"/>
+              <w:right w:type="dxa" w:w="120"/>
+            </w:tcMar>
+          </w:tcPr>
+          <w:p>
+            <w:r>
+              <w:rPr>
+                <w:b w:val="false"/>
+                <w:bCs w:val="false"/>
+                <w:sz w:val="20"/>
+                <w:szCs w:val="20"/>
+              </w:rPr>
               <w:t xml:space="preserve">Generates C4 System Context diagram (L1) as Mermaid source. No tools, pure text generation.</w:t>
             </w:r>
           </w:p>
@@ -765,30 +1130,66 @@
       <w:tr>
         <w:tc>
           <w:tcPr>
-            <w:tcW w:type="dxa" w:w="1800"/>
-          </w:tcPr>
-          <w:p>
-            <w:r>
+            <w:tcW w:type="dxa" w:w="2340"/>
+            <w:tcMar>
+              <w:top w:type="dxa" w:w="100"/>
+              <w:left w:type="dxa" w:w="120"/>
+              <w:bottom w:type="dxa" w:w="100"/>
+              <w:right w:type="dxa" w:w="120"/>
+            </w:tcMar>
+          </w:tcPr>
+          <w:p>
+            <w:r>
+              <w:rPr>
+                <w:b w:val="false"/>
+                <w:bCs w:val="false"/>
+                <w:sz w:val="20"/>
+                <w:szCs w:val="20"/>
+              </w:rPr>
               <w:t xml:space="preserve">Scribe</w:t>
             </w:r>
           </w:p>
         </w:tc>
         <w:tc>
           <w:tcPr>
-            <w:tcW w:type="dxa" w:w="2800"/>
-          </w:tcPr>
-          <w:p>
-            <w:r>
+            <w:tcW w:type="dxa" w:w="2340"/>
+            <w:tcMar>
+              <w:top w:type="dxa" w:w="100"/>
+              <w:left w:type="dxa" w:w="120"/>
+              <w:bottom w:type="dxa" w:w="100"/>
+              <w:right w:type="dxa" w:w="120"/>
+            </w:tcMar>
+          </w:tcPr>
+          <w:p>
+            <w:r>
+              <w:rPr>
+                <w:b w:val="false"/>
+                <w:bCs w:val="false"/>
+                <w:sz w:val="20"/>
+                <w:szCs w:val="20"/>
+              </w:rPr>
               <w:t xml:space="preserve">LFM2.5-VL-1.6B</w:t>
             </w:r>
           </w:p>
         </w:tc>
         <w:tc>
           <w:tcPr>
-            <w:tcW w:type="dxa" w:w="4400"/>
-          </w:tcPr>
-          <w:p>
-            <w:r>
+            <w:tcW w:type="dxa" w:w="4680"/>
+            <w:tcMar>
+              <w:top w:type="dxa" w:w="100"/>
+              <w:left w:type="dxa" w:w="120"/>
+              <w:bottom w:type="dxa" w:w="100"/>
+              <w:right w:type="dxa" w:w="120"/>
+            </w:tcMar>
+          </w:tcPr>
+          <w:p>
+            <w:r>
+              <w:rPr>
+                <w:b w:val="false"/>
+                <w:bCs w:val="false"/>
+                <w:sz w:val="20"/>
+                <w:szCs w:val="20"/>
+              </w:rPr>
               <w:t xml:space="preserve">Detects diff from prior spec version. Generates ADR: Context / Decision / Consequences. No tools.</w:t>
             </w:r>
           </w:p>
@@ -797,30 +1198,66 @@
       <w:tr>
         <w:tc>
           <w:tcPr>
-            <w:tcW w:type="dxa" w:w="1800"/>
-          </w:tcPr>
-          <w:p>
-            <w:r>
+            <w:tcW w:type="dxa" w:w="2340"/>
+            <w:tcMar>
+              <w:top w:type="dxa" w:w="100"/>
+              <w:left w:type="dxa" w:w="120"/>
+              <w:bottom w:type="dxa" w:w="100"/>
+              <w:right w:type="dxa" w:w="120"/>
+            </w:tcMar>
+          </w:tcPr>
+          <w:p>
+            <w:r>
+              <w:rPr>
+                <w:b w:val="false"/>
+                <w:bCs w:val="false"/>
+                <w:sz w:val="20"/>
+                <w:szCs w:val="20"/>
+              </w:rPr>
               <w:t xml:space="preserve">Critic</w:t>
             </w:r>
           </w:p>
         </w:tc>
         <w:tc>
           <w:tcPr>
-            <w:tcW w:type="dxa" w:w="2800"/>
-          </w:tcPr>
-          <w:p>
-            <w:r>
+            <w:tcW w:type="dxa" w:w="2340"/>
+            <w:tcMar>
+              <w:top w:type="dxa" w:w="100"/>
+              <w:left w:type="dxa" w:w="120"/>
+              <w:bottom w:type="dxa" w:w="100"/>
+              <w:right w:type="dxa" w:w="120"/>
+            </w:tcMar>
+          </w:tcPr>
+          <w:p>
+            <w:r>
+              <w:rPr>
+                <w:b w:val="false"/>
+                <w:bCs w:val="false"/>
+                <w:sz w:val="20"/>
+                <w:szCs w:val="20"/>
+              </w:rPr>
               <w:t xml:space="preserve">LFM2.5-VL-1.6B</w:t>
             </w:r>
           </w:p>
         </w:tc>
         <w:tc>
           <w:tcPr>
-            <w:tcW w:type="dxa" w:w="4400"/>
-          </w:tcPr>
-          <w:p>
-            <w:r>
+            <w:tcW w:type="dxa" w:w="4680"/>
+            <w:tcMar>
+              <w:top w:type="dxa" w:w="100"/>
+              <w:left w:type="dxa" w:w="120"/>
+              <w:bottom w:type="dxa" w:w="100"/>
+              <w:right w:type="dxa" w:w="120"/>
+            </w:tcMar>
+          </w:tcPr>
+          <w:p>
+            <w:r>
+              <w:rPr>
+                <w:b w:val="false"/>
+                <w:bCs w:val="false"/>
+                <w:sz w:val="20"/>
+                <w:szCs w:val="20"/>
+              </w:rPr>
               <w:t xml:space="preserve">Reviews Architect output as devil's advocate, surfaces gaps, SPOFs, missing integrations. No tools.</w:t>
             </w:r>
           </w:p>
@@ -829,30 +1266,66 @@
       <w:tr>
         <w:tc>
           <w:tcPr>
-            <w:tcW w:type="dxa" w:w="1800"/>
-          </w:tcPr>
-          <w:p>
-            <w:r>
+            <w:tcW w:type="dxa" w:w="2340"/>
+            <w:tcMar>
+              <w:top w:type="dxa" w:w="100"/>
+              <w:left w:type="dxa" w:w="120"/>
+              <w:bottom w:type="dxa" w:w="100"/>
+              <w:right w:type="dxa" w:w="120"/>
+            </w:tcMar>
+          </w:tcPr>
+          <w:p>
+            <w:r>
+              <w:rPr>
+                <w:b w:val="false"/>
+                <w:bCs w:val="false"/>
+                <w:sz w:val="20"/>
+                <w:szCs w:val="20"/>
+              </w:rPr>
               <w:t xml:space="preserve">Judge</w:t>
             </w:r>
           </w:p>
         </w:tc>
         <w:tc>
           <w:tcPr>
-            <w:tcW w:type="dxa" w:w="2800"/>
-          </w:tcPr>
-          <w:p>
-            <w:r>
+            <w:tcW w:type="dxa" w:w="2340"/>
+            <w:tcMar>
+              <w:top w:type="dxa" w:w="100"/>
+              <w:left w:type="dxa" w:w="120"/>
+              <w:bottom w:type="dxa" w:w="100"/>
+              <w:right w:type="dxa" w:w="120"/>
+            </w:tcMar>
+          </w:tcPr>
+          <w:p>
+            <w:r>
+              <w:rPr>
+                <w:b w:val="false"/>
+                <w:bCs w:val="false"/>
+                <w:sz w:val="20"/>
+                <w:szCs w:val="20"/>
+              </w:rPr>
               <w:t xml:space="preserve">Gemma 4 E4B QAT</w:t>
             </w:r>
           </w:p>
         </w:tc>
         <w:tc>
           <w:tcPr>
-            <w:tcW w:type="dxa" w:w="4400"/>
-          </w:tcPr>
-          <w:p>
-            <w:r>
+            <w:tcW w:type="dxa" w:w="4680"/>
+            <w:tcMar>
+              <w:top w:type="dxa" w:w="100"/>
+              <w:left w:type="dxa" w:w="120"/>
+              <w:bottom w:type="dxa" w:w="100"/>
+              <w:right w:type="dxa" w:w="120"/>
+            </w:tcMar>
+          </w:tcPr>
+          <w:p>
+            <w:r>
+              <w:rPr>
+                <w:b w:val="false"/>
+                <w:bCs w:val="false"/>
+                <w:sz w:val="20"/>
+                <w:szCs w:val="20"/>
+              </w:rPr>
               <w:t xml:space="preserve">Scores output against five quality metrics using a calculator tool. Flags items for human review.</w:t>
             </w:r>
           </w:p>
@@ -861,14 +1334,12 @@
     </w:tbl>
     <w:p>
       <w:pPr>
-        <w:spacing w:after="120"/>
-      </w:pPr>
-      <w:r>
-        <w:rPr>
-          <w:b w:val="false"/>
-          <w:bCs w:val="false"/>
-          <w:i w:val="false"/>
-          <w:iCs w:val="false"/>
+        <w:spacing w:after="160"/>
+      </w:pPr>
+      <w:r>
+        <w:rPr>
+          <w:sz w:val="21"/>
+          <w:szCs w:val="21"/>
         </w:rPr>
         <w:t xml:space="preserve">Model swap sequence: Gemma → LFM (after Architect) → Gemma (before Judge). Two swaps total per pipeline run.</w:t>
       </w:r>
@@ -876,22 +1347,27 @@
     <w:p>
       <w:pPr>
         <w:pStyle w:val="Heading1"/>
-        <w:spacing w:after="150" w:before="300"/>
-      </w:pPr>
-      <w:r>
+        <w:spacing w:after="160" w:before="400"/>
+      </w:pPr>
+      <w:r>
+        <w:rPr>
+          <w:b/>
+          <w:bCs/>
+          <w:color w:val="2E5B4F"/>
+          <w:sz w:val="30"/>
+          <w:szCs w:val="30"/>
+        </w:rPr>
         <w:t xml:space="preserve">Human in the Loop</w:t>
       </w:r>
     </w:p>
     <w:p>
       <w:pPr>
-        <w:spacing w:after="120"/>
-      </w:pPr>
-      <w:r>
-        <w:rPr>
-          <w:b w:val="false"/>
-          <w:bCs w:val="false"/>
-          <w:i w:val="false"/>
-          <w:iCs w:val="false"/>
+        <w:spacing w:after="160"/>
+      </w:pPr>
+      <w:r>
+        <w:rPr>
+          <w:sz w:val="21"/>
+          <w:szCs w:val="21"/>
         </w:rPr>
         <w:t xml:space="preserve">The pipeline is not fully automated by design. Every run pauses before persisting any artifact. The engineer reviews the consolidated output, C4 diagram, ADR, Critic gaps, Judge scores, and either approves or rejects with written comments.</w:t>
       </w:r>
@@ -901,11 +1377,15 @@
         <w:pStyle w:val="ListParagraph"/>
         <w:numPr>
           <w:ilvl w:val="0"/>
-          <w:numId w:val="1"/>
+          <w:numId w:val="2"/>
         </w:numPr>
-        <w:spacing w:after="80"/>
-      </w:pPr>
-      <w:r>
+        <w:spacing w:after="100"/>
+      </w:pPr>
+      <w:r>
+        <w:rPr>
+          <w:sz w:val="21"/>
+          <w:szCs w:val="21"/>
+        </w:rPr>
         <w:t xml:space="preserve">Approve → all outputs written to versioned artifact store in PostgreSQL</w:t>
       </w:r>
     </w:p>
@@ -914,24 +1394,26 @@
         <w:pStyle w:val="ListParagraph"/>
         <w:numPr>
           <w:ilvl w:val="0"/>
-          <w:numId w:val="1"/>
+          <w:numId w:val="2"/>
         </w:numPr>
-        <w:spacing w:after="80"/>
-      </w:pPr>
-      <w:r>
+        <w:spacing w:after="100"/>
+      </w:pPr>
+      <w:r>
+        <w:rPr>
+          <w:sz w:val="21"/>
+          <w:szCs w:val="21"/>
+        </w:rPr>
         <w:t xml:space="preserve">Reject → comments written as revision notes to the blackboard → pipeline re-runs from Critic</w:t>
       </w:r>
     </w:p>
     <w:p>
       <w:pPr>
-        <w:spacing w:after="120"/>
-      </w:pPr>
-      <w:r>
-        <w:rPr>
-          <w:b w:val="false"/>
-          <w:bCs w:val="false"/>
-          <w:i w:val="false"/>
-          <w:iCs w:val="false"/>
+        <w:spacing w:after="160"/>
+      </w:pPr>
+      <w:r>
+        <w:rPr>
+          <w:sz w:val="21"/>
+          <w:szCs w:val="21"/>
         </w:rPr>
         <w:t xml:space="preserve">This step is philosophically central, not a safety feature. The AI proposes. The engineer decides. The ADR records why. The decision trail belongs to the engineer, not the model.</w:t>
       </w:r>
@@ -939,29 +1421,34 @@
     <w:p>
       <w:pPr>
         <w:pStyle w:val="Heading1"/>
-        <w:spacing w:after="150" w:before="300"/>
-      </w:pPr>
-      <w:r>
+        <w:spacing w:after="160" w:before="400"/>
+      </w:pPr>
+      <w:r>
+        <w:rPr>
+          <w:b/>
+          <w:bCs/>
+          <w:color w:val="2E5B4F"/>
+          <w:sz w:val="30"/>
+          <w:szCs w:val="30"/>
+        </w:rPr>
         <w:t xml:space="preserve">Architecture Quality Metrics</w:t>
       </w:r>
     </w:p>
     <w:p>
       <w:pPr>
-        <w:spacing w:after="120"/>
-      </w:pPr>
-      <w:r>
-        <w:rPr>
-          <w:b w:val="false"/>
-          <w:bCs w:val="false"/>
-          <w:i w:val="false"/>
-          <w:iCs w:val="false"/>
+        <w:spacing w:after="160"/>
+      </w:pPr>
+      <w:r>
+        <w:rPr>
+          <w:sz w:val="21"/>
+          <w:szCs w:val="21"/>
         </w:rPr>
         <w:t xml:space="preserve">The Judge agent scores every run against five deterministic metrics using a calculator tool:</w:t>
       </w:r>
     </w:p>
     <w:tbl>
       <w:tblPr>
-        <w:tblW w:type="dxa" w:w="9000"/>
+        <w:tblW w:type="dxa" w:w="9360"/>
         <w:tblBorders>
           <w:top w:val="single" w:color="auto" w:sz="4"/>
           <w:left w:val="single" w:color="auto" w:sz="4"/>
@@ -972,20 +1459,31 @@
         </w:tblBorders>
       </w:tblPr>
       <w:tblGrid>
-        <w:gridCol w:w="3000"/>
-        <w:gridCol w:w="6000"/>
+        <w:gridCol w:w="3120"/>
+        <w:gridCol w:w="6240"/>
       </w:tblGrid>
       <w:tr>
-        <w:tc>
-          <w:tcPr>
-            <w:tcW w:type="dxa" w:w="3000"/>
-            <w:shd w:fill="D9D9D9" w:val="clear"/>
+        <w:trPr>
+          <w:tblHeader/>
+        </w:trPr>
+        <w:tc>
+          <w:tcPr>
+            <w:tcW w:type="dxa" w:w="3120"/>
+            <w:shd w:fill="EFEBE2" w:val="clear"/>
+            <w:tcMar>
+              <w:top w:type="dxa" w:w="100"/>
+              <w:left w:type="dxa" w:w="120"/>
+              <w:bottom w:type="dxa" w:w="100"/>
+              <w:right w:type="dxa" w:w="120"/>
+            </w:tcMar>
           </w:tcPr>
           <w:p>
             <w:r>
               <w:rPr>
                 <w:b/>
                 <w:bCs/>
+                <w:sz w:val="20"/>
+                <w:szCs w:val="20"/>
               </w:rPr>
               <w:t xml:space="preserve">Metric</w:t>
             </w:r>
@@ -993,14 +1491,22 @@
         </w:tc>
         <w:tc>
           <w:tcPr>
-            <w:tcW w:type="dxa" w:w="6000"/>
-            <w:shd w:fill="D9D9D9" w:val="clear"/>
+            <w:tcW w:type="dxa" w:w="6240"/>
+            <w:shd w:fill="EFEBE2" w:val="clear"/>
+            <w:tcMar>
+              <w:top w:type="dxa" w:w="100"/>
+              <w:left w:type="dxa" w:w="120"/>
+              <w:bottom w:type="dxa" w:w="100"/>
+              <w:right w:type="dxa" w:w="120"/>
+            </w:tcMar>
           </w:tcPr>
           <w:p>
             <w:r>
               <w:rPr>
                 <w:b/>
                 <w:bCs/>
+                <w:sz w:val="20"/>
+                <w:szCs w:val="20"/>
               </w:rPr>
               <w:t xml:space="preserve">Definition</w:t>
             </w:r>
@@ -1010,20 +1516,44 @@
       <w:tr>
         <w:tc>
           <w:tcPr>
-            <w:tcW w:type="dxa" w:w="3000"/>
-          </w:tcPr>
-          <w:p>
-            <w:r>
+            <w:tcW w:type="dxa" w:w="3120"/>
+            <w:tcMar>
+              <w:top w:type="dxa" w:w="100"/>
+              <w:left w:type="dxa" w:w="120"/>
+              <w:bottom w:type="dxa" w:w="100"/>
+              <w:right w:type="dxa" w:w="120"/>
+            </w:tcMar>
+          </w:tcPr>
+          <w:p>
+            <w:r>
+              <w:rPr>
+                <w:b w:val="false"/>
+                <w:bCs w:val="false"/>
+                <w:sz w:val="20"/>
+                <w:szCs w:val="20"/>
+              </w:rPr>
               <w:t xml:space="preserve">spof_count</w:t>
             </w:r>
           </w:p>
         </w:tc>
         <w:tc>
           <w:tcPr>
-            <w:tcW w:type="dxa" w:w="6000"/>
-          </w:tcPr>
-          <w:p>
-            <w:r>
+            <w:tcW w:type="dxa" w:w="6240"/>
+            <w:tcMar>
+              <w:top w:type="dxa" w:w="100"/>
+              <w:left w:type="dxa" w:w="120"/>
+              <w:bottom w:type="dxa" w:w="100"/>
+              <w:right w:type="dxa" w:w="120"/>
+            </w:tcMar>
+          </w:tcPr>
+          <w:p>
+            <w:r>
+              <w:rPr>
+                <w:b w:val="false"/>
+                <w:bCs w:val="false"/>
+                <w:sz w:val="20"/>
+                <w:szCs w:val="20"/>
+              </w:rPr>
               <w:t xml:space="preserve">Number of single points of failure flagged by Critic</w:t>
             </w:r>
           </w:p>
@@ -1032,20 +1562,44 @@
       <w:tr>
         <w:tc>
           <w:tcPr>
-            <w:tcW w:type="dxa" w:w="3000"/>
-          </w:tcPr>
-          <w:p>
-            <w:r>
+            <w:tcW w:type="dxa" w:w="3120"/>
+            <w:tcMar>
+              <w:top w:type="dxa" w:w="100"/>
+              <w:left w:type="dxa" w:w="120"/>
+              <w:bottom w:type="dxa" w:w="100"/>
+              <w:right w:type="dxa" w:w="120"/>
+            </w:tcMar>
+          </w:tcPr>
+          <w:p>
+            <w:r>
+              <w:rPr>
+                <w:b w:val="false"/>
+                <w:bCs w:val="false"/>
+                <w:sz w:val="20"/>
+                <w:szCs w:val="20"/>
+              </w:rPr>
               <w:t xml:space="preserve">redundancy_ratio</w:t>
             </w:r>
           </w:p>
         </w:tc>
         <w:tc>
           <w:tcPr>
-            <w:tcW w:type="dxa" w:w="6000"/>
-          </w:tcPr>
-          <w:p>
-            <w:r>
+            <w:tcW w:type="dxa" w:w="6240"/>
+            <w:tcMar>
+              <w:top w:type="dxa" w:w="100"/>
+              <w:left w:type="dxa" w:w="120"/>
+              <w:bottom w:type="dxa" w:w="100"/>
+              <w:right w:type="dxa" w:w="120"/>
+            </w:tcMar>
+          </w:tcPr>
+          <w:p>
+            <w:r>
+              <w:rPr>
+                <w:b w:val="false"/>
+                <w:bCs w:val="false"/>
+                <w:sz w:val="20"/>
+                <w:szCs w:val="20"/>
+              </w:rPr>
               <w:t xml:space="preserve">Redundant components / total components (0–1)</w:t>
             </w:r>
           </w:p>
@@ -1054,20 +1608,44 @@
       <w:tr>
         <w:tc>
           <w:tcPr>
-            <w:tcW w:type="dxa" w:w="3000"/>
-          </w:tcPr>
-          <w:p>
-            <w:r>
+            <w:tcW w:type="dxa" w:w="3120"/>
+            <w:tcMar>
+              <w:top w:type="dxa" w:w="100"/>
+              <w:left w:type="dxa" w:w="120"/>
+              <w:bottom w:type="dxa" w:w="100"/>
+              <w:right w:type="dxa" w:w="120"/>
+            </w:tcMar>
+          </w:tcPr>
+          <w:p>
+            <w:r>
+              <w:rPr>
+                <w:b w:val="false"/>
+                <w:bCs w:val="false"/>
+                <w:sz w:val="20"/>
+                <w:szCs w:val="20"/>
+              </w:rPr>
               <w:t xml:space="preserve">cost_per_component</w:t>
             </w:r>
           </w:p>
         </w:tc>
         <w:tc>
           <w:tcPr>
-            <w:tcW w:type="dxa" w:w="6000"/>
-          </w:tcPr>
-          <w:p>
-            <w:r>
+            <w:tcW w:type="dxa" w:w="6240"/>
+            <w:tcMar>
+              <w:top w:type="dxa" w:w="100"/>
+              <w:left w:type="dxa" w:w="120"/>
+              <w:bottom w:type="dxa" w:w="100"/>
+              <w:right w:type="dxa" w:w="120"/>
+            </w:tcMar>
+          </w:tcPr>
+          <w:p>
+            <w:r>
+              <w:rPr>
+                <w:b w:val="false"/>
+                <w:bCs w:val="false"/>
+                <w:sz w:val="20"/>
+                <w:szCs w:val="20"/>
+              </w:rPr>
               <w:t xml:space="preserve">Total Infracost estimate / component count (USD)</w:t>
             </w:r>
           </w:p>
@@ -1076,20 +1654,44 @@
       <w:tr>
         <w:tc>
           <w:tcPr>
-            <w:tcW w:type="dxa" w:w="3000"/>
-          </w:tcPr>
-          <w:p>
-            <w:r>
+            <w:tcW w:type="dxa" w:w="3120"/>
+            <w:tcMar>
+              <w:top w:type="dxa" w:w="100"/>
+              <w:left w:type="dxa" w:w="120"/>
+              <w:bottom w:type="dxa" w:w="100"/>
+              <w:right w:type="dxa" w:w="120"/>
+            </w:tcMar>
+          </w:tcPr>
+          <w:p>
+            <w:r>
+              <w:rPr>
+                <w:b w:val="false"/>
+                <w:bCs w:val="false"/>
+                <w:sz w:val="20"/>
+                <w:szCs w:val="20"/>
+              </w:rPr>
               <w:t xml:space="preserve">integration_coverage</w:t>
             </w:r>
           </w:p>
         </w:tc>
         <w:tc>
           <w:tcPr>
-            <w:tcW w:type="dxa" w:w="6000"/>
-          </w:tcPr>
-          <w:p>
-            <w:r>
+            <w:tcW w:type="dxa" w:w="6240"/>
+            <w:tcMar>
+              <w:top w:type="dxa" w:w="100"/>
+              <w:left w:type="dxa" w:w="120"/>
+              <w:bottom w:type="dxa" w:w="100"/>
+              <w:right w:type="dxa" w:w="120"/>
+            </w:tcMar>
+          </w:tcPr>
+          <w:p>
+            <w:r>
+              <w:rPr>
+                <w:b w:val="false"/>
+                <w:bCs w:val="false"/>
+                <w:sz w:val="20"/>
+                <w:szCs w:val="20"/>
+              </w:rPr>
               <w:t xml:space="preserve">Defined integrations / required integration points from spec (0–1)</w:t>
             </w:r>
           </w:p>
@@ -1098,20 +1700,44 @@
       <w:tr>
         <w:tc>
           <w:tcPr>
-            <w:tcW w:type="dxa" w:w="3000"/>
-          </w:tcPr>
-          <w:p>
-            <w:r>
+            <w:tcW w:type="dxa" w:w="3120"/>
+            <w:tcMar>
+              <w:top w:type="dxa" w:w="100"/>
+              <w:left w:type="dxa" w:w="120"/>
+              <w:bottom w:type="dxa" w:w="100"/>
+              <w:right w:type="dxa" w:w="120"/>
+            </w:tcMar>
+          </w:tcPr>
+          <w:p>
+            <w:r>
+              <w:rPr>
+                <w:b w:val="false"/>
+                <w:bCs w:val="false"/>
+                <w:sz w:val="20"/>
+                <w:szCs w:val="20"/>
+              </w:rPr>
               <w:t xml:space="preserve">adrs_per_diff</w:t>
             </w:r>
           </w:p>
         </w:tc>
         <w:tc>
           <w:tcPr>
-            <w:tcW w:type="dxa" w:w="6000"/>
-          </w:tcPr>
-          <w:p>
-            <w:r>
+            <w:tcW w:type="dxa" w:w="6240"/>
+            <w:tcMar>
+              <w:top w:type="dxa" w:w="100"/>
+              <w:left w:type="dxa" w:w="120"/>
+              <w:bottom w:type="dxa" w:w="100"/>
+              <w:right w:type="dxa" w:w="120"/>
+            </w:tcMar>
+          </w:tcPr>
+          <w:p>
+            <w:r>
+              <w:rPr>
+                <w:b w:val="false"/>
+                <w:bCs w:val="false"/>
+                <w:sz w:val="20"/>
+                <w:szCs w:val="20"/>
+              </w:rPr>
               <w:t xml:space="preserve">ADRs generated / spec diff hunks (should be ≥ 1)</w:t>
             </w:r>
           </w:p>
@@ -1121,15 +1747,22 @@
     <w:p>
       <w:pPr>
         <w:pStyle w:val="Heading1"/>
-        <w:spacing w:after="150" w:before="300"/>
-      </w:pPr>
-      <w:r>
+        <w:spacing w:after="160" w:before="400"/>
+      </w:pPr>
+      <w:r>
+        <w:rPr>
+          <w:b/>
+          <w:bCs/>
+          <w:color w:val="2E5B4F"/>
+          <w:sz w:val="30"/>
+          <w:szCs w:val="30"/>
+        </w:rPr>
         <w:t xml:space="preserve">Technical Stack</w:t>
       </w:r>
     </w:p>
     <w:tbl>
       <w:tblPr>
-        <w:tblW w:type="dxa" w:w="9000"/>
+        <w:tblW w:type="dxa" w:w="9360"/>
         <w:tblBorders>
           <w:top w:val="single" w:color="auto" w:sz="4"/>
           <w:left w:val="single" w:color="auto" w:sz="4"/>
@@ -1140,21 +1773,32 @@
         </w:tblBorders>
       </w:tblPr>
       <w:tblGrid>
-        <w:gridCol w:w="2200"/>
-        <w:gridCol w:w="2800"/>
-        <w:gridCol w:w="4000"/>
+        <w:gridCol w:w="2080"/>
+        <w:gridCol w:w="3120"/>
+        <w:gridCol w:w="4160"/>
       </w:tblGrid>
       <w:tr>
-        <w:tc>
-          <w:tcPr>
-            <w:tcW w:type="dxa" w:w="2200"/>
-            <w:shd w:fill="D9D9D9" w:val="clear"/>
+        <w:trPr>
+          <w:tblHeader/>
+        </w:trPr>
+        <w:tc>
+          <w:tcPr>
+            <w:tcW w:type="dxa" w:w="2080"/>
+            <w:shd w:fill="EFEBE2" w:val="clear"/>
+            <w:tcMar>
+              <w:top w:type="dxa" w:w="100"/>
+              <w:left w:type="dxa" w:w="120"/>
+              <w:bottom w:type="dxa" w:w="100"/>
+              <w:right w:type="dxa" w:w="120"/>
+            </w:tcMar>
           </w:tcPr>
           <w:p>
             <w:r>
               <w:rPr>
                 <w:b/>
                 <w:bCs/>
+                <w:sz w:val="20"/>
+                <w:szCs w:val="20"/>
               </w:rPr>
               <w:t xml:space="preserve">Layer</w:t>
             </w:r>
@@ -1162,14 +1806,22 @@
         </w:tc>
         <w:tc>
           <w:tcPr>
-            <w:tcW w:type="dxa" w:w="2800"/>
-            <w:shd w:fill="D9D9D9" w:val="clear"/>
+            <w:tcW w:type="dxa" w:w="3120"/>
+            <w:shd w:fill="EFEBE2" w:val="clear"/>
+            <w:tcMar>
+              <w:top w:type="dxa" w:w="100"/>
+              <w:left w:type="dxa" w:w="120"/>
+              <w:bottom w:type="dxa" w:w="100"/>
+              <w:right w:type="dxa" w:w="120"/>
+            </w:tcMar>
           </w:tcPr>
           <w:p>
             <w:r>
               <w:rPr>
                 <w:b/>
                 <w:bCs/>
+                <w:sz w:val="20"/>
+                <w:szCs w:val="20"/>
               </w:rPr>
               <w:t xml:space="preserve">Technology</w:t>
             </w:r>
@@ -1177,14 +1829,22 @@
         </w:tc>
         <w:tc>
           <w:tcPr>
-            <w:tcW w:type="dxa" w:w="4000"/>
-            <w:shd w:fill="D9D9D9" w:val="clear"/>
+            <w:tcW w:type="dxa" w:w="4160"/>
+            <w:shd w:fill="EFEBE2" w:val="clear"/>
+            <w:tcMar>
+              <w:top w:type="dxa" w:w="100"/>
+              <w:left w:type="dxa" w:w="120"/>
+              <w:bottom w:type="dxa" w:w="100"/>
+              <w:right w:type="dxa" w:w="120"/>
+            </w:tcMar>
           </w:tcPr>
           <w:p>
             <w:r>
               <w:rPr>
                 <w:b/>
                 <w:bCs/>
+                <w:sz w:val="20"/>
+                <w:szCs w:val="20"/>
               </w:rPr>
               <w:t xml:space="preserve">Role</w:t>
             </w:r>
@@ -1194,30 +1854,66 @@
       <w:tr>
         <w:tc>
           <w:tcPr>
-            <w:tcW w:type="dxa" w:w="2200"/>
-          </w:tcPr>
-          <w:p>
-            <w:r>
+            <w:tcW w:type="dxa" w:w="2080"/>
+            <w:tcMar>
+              <w:top w:type="dxa" w:w="100"/>
+              <w:left w:type="dxa" w:w="120"/>
+              <w:bottom w:type="dxa" w:w="100"/>
+              <w:right w:type="dxa" w:w="120"/>
+            </w:tcMar>
+          </w:tcPr>
+          <w:p>
+            <w:r>
+              <w:rPr>
+                <w:b w:val="false"/>
+                <w:bCs w:val="false"/>
+                <w:sz w:val="20"/>
+                <w:szCs w:val="20"/>
+              </w:rPr>
               <w:t xml:space="preserve">Inference</w:t>
             </w:r>
           </w:p>
         </w:tc>
         <w:tc>
           <w:tcPr>
-            <w:tcW w:type="dxa" w:w="2800"/>
-          </w:tcPr>
-          <w:p>
-            <w:r>
+            <w:tcW w:type="dxa" w:w="3120"/>
+            <w:tcMar>
+              <w:top w:type="dxa" w:w="100"/>
+              <w:left w:type="dxa" w:w="120"/>
+              <w:bottom w:type="dxa" w:w="100"/>
+              <w:right w:type="dxa" w:w="120"/>
+            </w:tcMar>
+          </w:tcPr>
+          <w:p>
+            <w:r>
+              <w:rPr>
+                <w:b w:val="false"/>
+                <w:bCs w:val="false"/>
+                <w:sz w:val="20"/>
+                <w:szCs w:val="20"/>
+              </w:rPr>
               <w:t xml:space="preserve">llama.cpp build 9595 · llama-server</w:t>
             </w:r>
           </w:p>
         </w:tc>
         <w:tc>
           <w:tcPr>
-            <w:tcW w:type="dxa" w:w="4000"/>
-          </w:tcPr>
-          <w:p>
-            <w:r>
+            <w:tcW w:type="dxa" w:w="4160"/>
+            <w:tcMar>
+              <w:top w:type="dxa" w:w="100"/>
+              <w:left w:type="dxa" w:w="120"/>
+              <w:bottom w:type="dxa" w:w="100"/>
+              <w:right w:type="dxa" w:w="120"/>
+            </w:tcMar>
+          </w:tcPr>
+          <w:p>
+            <w:r>
+              <w:rPr>
+                <w:b w:val="false"/>
+                <w:bCs w:val="false"/>
+                <w:sz w:val="20"/>
+                <w:szCs w:val="20"/>
+              </w:rPr>
               <w:t xml:space="preserve">CPU-only local inference, router mode, LRU hot-swap</w:t>
             </w:r>
           </w:p>
@@ -1226,30 +1922,66 @@
       <w:tr>
         <w:tc>
           <w:tcPr>
-            <w:tcW w:type="dxa" w:w="2200"/>
-          </w:tcPr>
-          <w:p>
-            <w:r>
+            <w:tcW w:type="dxa" w:w="2080"/>
+            <w:tcMar>
+              <w:top w:type="dxa" w:w="100"/>
+              <w:left w:type="dxa" w:w="120"/>
+              <w:bottom w:type="dxa" w:w="100"/>
+              <w:right w:type="dxa" w:w="120"/>
+            </w:tcMar>
+          </w:tcPr>
+          <w:p>
+            <w:r>
+              <w:rPr>
+                <w:b w:val="false"/>
+                <w:bCs w:val="false"/>
+                <w:sz w:val="20"/>
+                <w:szCs w:val="20"/>
+              </w:rPr>
               <w:t xml:space="preserve">Orchestration</w:t>
             </w:r>
           </w:p>
         </w:tc>
         <w:tc>
           <w:tcPr>
-            <w:tcW w:type="dxa" w:w="2800"/>
-          </w:tcPr>
-          <w:p>
-            <w:r>
+            <w:tcW w:type="dxa" w:w="3120"/>
+            <w:tcMar>
+              <w:top w:type="dxa" w:w="100"/>
+              <w:left w:type="dxa" w:w="120"/>
+              <w:bottom w:type="dxa" w:w="100"/>
+              <w:right w:type="dxa" w:w="120"/>
+            </w:tcMar>
+          </w:tcPr>
+          <w:p>
+            <w:r>
+              <w:rPr>
+                <w:b w:val="false"/>
+                <w:bCs w:val="false"/>
+                <w:sz w:val="20"/>
+                <w:szCs w:val="20"/>
+              </w:rPr>
               <w:t xml:space="preserve">DBOS (dbos-transact-py)</w:t>
             </w:r>
           </w:p>
         </w:tc>
         <w:tc>
           <w:tcPr>
-            <w:tcW w:type="dxa" w:w="4000"/>
-          </w:tcPr>
-          <w:p>
-            <w:r>
+            <w:tcW w:type="dxa" w:w="4160"/>
+            <w:tcMar>
+              <w:top w:type="dxa" w:w="100"/>
+              <w:left w:type="dxa" w:w="120"/>
+              <w:bottom w:type="dxa" w:w="100"/>
+              <w:right w:type="dxa" w:w="120"/>
+            </w:tcMar>
+          </w:tcPr>
+          <w:p>
+            <w:r>
+              <w:rPr>
+                <w:b w:val="false"/>
+                <w:bCs w:val="false"/>
+                <w:sz w:val="20"/>
+                <w:szCs w:val="20"/>
+              </w:rPr>
               <w:t xml:space="preserve">Durable workflow execution over PostgreSQL, safe resume after thermal cutoff or OOM</w:t>
             </w:r>
           </w:p>
@@ -1258,30 +1990,66 @@
       <w:tr>
         <w:tc>
           <w:tcPr>
-            <w:tcW w:type="dxa" w:w="2200"/>
-          </w:tcPr>
-          <w:p>
-            <w:r>
+            <w:tcW w:type="dxa" w:w="2080"/>
+            <w:tcMar>
+              <w:top w:type="dxa" w:w="100"/>
+              <w:left w:type="dxa" w:w="120"/>
+              <w:bottom w:type="dxa" w:w="100"/>
+              <w:right w:type="dxa" w:w="120"/>
+            </w:tcMar>
+          </w:tcPr>
+          <w:p>
+            <w:r>
+              <w:rPr>
+                <w:b w:val="false"/>
+                <w:bCs w:val="false"/>
+                <w:sz w:val="20"/>
+                <w:szCs w:val="20"/>
+              </w:rPr>
               <w:t xml:space="preserve">State / Storage</w:t>
             </w:r>
           </w:p>
         </w:tc>
         <w:tc>
           <w:tcPr>
-            <w:tcW w:type="dxa" w:w="2800"/>
-          </w:tcPr>
-          <w:p>
-            <w:r>
+            <w:tcW w:type="dxa" w:w="3120"/>
+            <w:tcMar>
+              <w:top w:type="dxa" w:w="100"/>
+              <w:left w:type="dxa" w:w="120"/>
+              <w:bottom w:type="dxa" w:w="100"/>
+              <w:right w:type="dxa" w:w="120"/>
+            </w:tcMar>
+          </w:tcPr>
+          <w:p>
+            <w:r>
+              <w:rPr>
+                <w:b w:val="false"/>
+                <w:bCs w:val="false"/>
+                <w:sz w:val="20"/>
+                <w:szCs w:val="20"/>
+              </w:rPr>
               <w:t xml:space="preserve">PostgreSQL (port 5432)</w:t>
             </w:r>
           </w:p>
         </w:tc>
         <w:tc>
           <w:tcPr>
-            <w:tcW w:type="dxa" w:w="4000"/>
-          </w:tcPr>
-          <w:p>
-            <w:r>
+            <w:tcW w:type="dxa" w:w="4160"/>
+            <w:tcMar>
+              <w:top w:type="dxa" w:w="100"/>
+              <w:left w:type="dxa" w:w="120"/>
+              <w:bottom w:type="dxa" w:w="100"/>
+              <w:right w:type="dxa" w:w="120"/>
+            </w:tcMar>
+          </w:tcPr>
+          <w:p>
+            <w:r>
+              <w:rPr>
+                <w:b w:val="false"/>
+                <w:bCs w:val="false"/>
+                <w:sz w:val="20"/>
+                <w:szCs w:val="20"/>
+              </w:rPr>
               <w:t xml:space="preserve">DBOS workflow state, blackboard events, versioned artifact store</w:t>
             </w:r>
           </w:p>
@@ -1290,30 +2058,66 @@
       <w:tr>
         <w:tc>
           <w:tcPr>
-            <w:tcW w:type="dxa" w:w="2200"/>
-          </w:tcPr>
-          <w:p>
-            <w:r>
+            <w:tcW w:type="dxa" w:w="2080"/>
+            <w:tcMar>
+              <w:top w:type="dxa" w:w="100"/>
+              <w:left w:type="dxa" w:w="120"/>
+              <w:bottom w:type="dxa" w:w="100"/>
+              <w:right w:type="dxa" w:w="120"/>
+            </w:tcMar>
+          </w:tcPr>
+          <w:p>
+            <w:r>
+              <w:rPr>
+                <w:b w:val="false"/>
+                <w:bCs w:val="false"/>
+                <w:sz w:val="20"/>
+                <w:szCs w:val="20"/>
+              </w:rPr>
               <w:t xml:space="preserve">Observability</w:t>
             </w:r>
           </w:p>
         </w:tc>
         <w:tc>
           <w:tcPr>
-            <w:tcW w:type="dxa" w:w="2800"/>
-          </w:tcPr>
-          <w:p>
-            <w:r>
+            <w:tcW w:type="dxa" w:w="3120"/>
+            <w:tcMar>
+              <w:top w:type="dxa" w:w="100"/>
+              <w:left w:type="dxa" w:w="120"/>
+              <w:bottom w:type="dxa" w:w="100"/>
+              <w:right w:type="dxa" w:w="120"/>
+            </w:tcMar>
+          </w:tcPr>
+          <w:p>
+            <w:r>
+              <w:rPr>
+                <w:b w:val="false"/>
+                <w:bCs w:val="false"/>
+                <w:sz w:val="20"/>
+                <w:szCs w:val="20"/>
+              </w:rPr>
               <w:t xml:space="preserve">Arize Phoenix (port 6006)</w:t>
             </w:r>
           </w:p>
         </w:tc>
         <w:tc>
           <w:tcPr>
-            <w:tcW w:type="dxa" w:w="4000"/>
-          </w:tcPr>
-          <w:p>
-            <w:r>
+            <w:tcW w:type="dxa" w:w="4160"/>
+            <w:tcMar>
+              <w:top w:type="dxa" w:w="100"/>
+              <w:left w:type="dxa" w:w="120"/>
+              <w:bottom w:type="dxa" w:w="100"/>
+              <w:right w:type="dxa" w:w="120"/>
+            </w:tcMar>
+          </w:tcPr>
+          <w:p>
+            <w:r>
+              <w:rPr>
+                <w:b w:val="false"/>
+                <w:bCs w:val="false"/>
+                <w:sz w:val="20"/>
+                <w:szCs w:val="20"/>
+              </w:rPr>
               <w:t xml:space="preserve">Local LLM trace collection via OpenTelemetry / OpenInference</w:t>
             </w:r>
           </w:p>
@@ -1322,30 +2126,66 @@
       <w:tr>
         <w:tc>
           <w:tcPr>
-            <w:tcW w:type="dxa" w:w="2200"/>
-          </w:tcPr>
-          <w:p>
-            <w:r>
+            <w:tcW w:type="dxa" w:w="2080"/>
+            <w:tcMar>
+              <w:top w:type="dxa" w:w="100"/>
+              <w:left w:type="dxa" w:w="120"/>
+              <w:bottom w:type="dxa" w:w="100"/>
+              <w:right w:type="dxa" w:w="120"/>
+            </w:tcMar>
+          </w:tcPr>
+          <w:p>
+            <w:r>
+              <w:rPr>
+                <w:b w:val="false"/>
+                <w:bCs w:val="false"/>
+                <w:sz w:val="20"/>
+                <w:szCs w:val="20"/>
+              </w:rPr>
               <w:t xml:space="preserve">Pricing API</w:t>
             </w:r>
           </w:p>
         </w:tc>
         <w:tc>
           <w:tcPr>
-            <w:tcW w:type="dxa" w:w="2800"/>
-          </w:tcPr>
-          <w:p>
-            <w:r>
-              <w:t xml:space="preserve">Infracost (Docker, port 4000)</w:t>
-            </w:r>
-          </w:p>
-        </w:tc>
-        <w:tc>
-          <w:tcPr>
-            <w:tcW w:type="dxa" w:w="4000"/>
-          </w:tcPr>
-          <w:p>
-            <w:r>
+            <w:tcW w:type="dxa" w:w="3120"/>
+            <w:tcMar>
+              <w:top w:type="dxa" w:w="100"/>
+              <w:left w:type="dxa" w:w="120"/>
+              <w:bottom w:type="dxa" w:w="100"/>
+              <w:right w:type="dxa" w:w="120"/>
+            </w:tcMar>
+          </w:tcPr>
+          <w:p>
+            <w:r>
+              <w:rPr>
+                <w:b w:val="false"/>
+                <w:bCs w:val="false"/>
+                <w:sz w:val="20"/>
+                <w:szCs w:val="20"/>
+              </w:rPr>
+              <w:t xml:space="preserve">Infracost (Docker Desktop, port 4000)</w:t>
+            </w:r>
+          </w:p>
+        </w:tc>
+        <w:tc>
+          <w:tcPr>
+            <w:tcW w:type="dxa" w:w="4160"/>
+            <w:tcMar>
+              <w:top w:type="dxa" w:w="100"/>
+              <w:left w:type="dxa" w:w="120"/>
+              <w:bottom w:type="dxa" w:w="100"/>
+              <w:right w:type="dxa" w:w="120"/>
+            </w:tcMar>
+          </w:tcPr>
+          <w:p>
+            <w:r>
+              <w:rPr>
+                <w:b w:val="false"/>
+                <w:bCs w:val="false"/>
+                <w:sz w:val="20"/>
+                <w:szCs w:val="20"/>
+              </w:rPr>
               <w:t xml:space="preserve">Self-hosted cloud pricing GraphQL API, no outbound dependency</w:t>
             </w:r>
           </w:p>
@@ -1354,30 +2194,66 @@
       <w:tr>
         <w:tc>
           <w:tcPr>
-            <w:tcW w:type="dxa" w:w="2200"/>
-          </w:tcPr>
-          <w:p>
-            <w:r>
+            <w:tcW w:type="dxa" w:w="2080"/>
+            <w:tcMar>
+              <w:top w:type="dxa" w:w="100"/>
+              <w:left w:type="dxa" w:w="120"/>
+              <w:bottom w:type="dxa" w:w="100"/>
+              <w:right w:type="dxa" w:w="120"/>
+            </w:tcMar>
+          </w:tcPr>
+          <w:p>
+            <w:r>
+              <w:rPr>
+                <w:b w:val="false"/>
+                <w:bCs w:val="false"/>
+                <w:sz w:val="20"/>
+                <w:szCs w:val="20"/>
+              </w:rPr>
               <w:t xml:space="preserve">Diagram Rendering</w:t>
             </w:r>
           </w:p>
         </w:tc>
         <w:tc>
           <w:tcPr>
-            <w:tcW w:type="dxa" w:w="2800"/>
-          </w:tcPr>
-          <w:p>
-            <w:r>
-              <w:t xml:space="preserve">mermaid.ink (Docker, port 3001)</w:t>
-            </w:r>
-          </w:p>
-        </w:tc>
-        <w:tc>
-          <w:tcPr>
-            <w:tcW w:type="dxa" w:w="4000"/>
-          </w:tcPr>
-          <w:p>
-            <w:r>
+            <w:tcW w:type="dxa" w:w="3120"/>
+            <w:tcMar>
+              <w:top w:type="dxa" w:w="100"/>
+              <w:left w:type="dxa" w:w="120"/>
+              <w:bottom w:type="dxa" w:w="100"/>
+              <w:right w:type="dxa" w:w="120"/>
+            </w:tcMar>
+          </w:tcPr>
+          <w:p>
+            <w:r>
+              <w:rPr>
+                <w:b w:val="false"/>
+                <w:bCs w:val="false"/>
+                <w:sz w:val="20"/>
+                <w:szCs w:val="20"/>
+              </w:rPr>
+              <w:t xml:space="preserve">mermaid.ink (Docker Desktop, port 3001)</w:t>
+            </w:r>
+          </w:p>
+        </w:tc>
+        <w:tc>
+          <w:tcPr>
+            <w:tcW w:type="dxa" w:w="4160"/>
+            <w:tcMar>
+              <w:top w:type="dxa" w:w="100"/>
+              <w:left w:type="dxa" w:w="120"/>
+              <w:bottom w:type="dxa" w:w="100"/>
+              <w:right w:type="dxa" w:w="120"/>
+            </w:tcMar>
+          </w:tcPr>
+          <w:p>
+            <w:r>
+              <w:rPr>
+                <w:b w:val="false"/>
+                <w:bCs w:val="false"/>
+                <w:sz w:val="20"/>
+                <w:szCs w:val="20"/>
+              </w:rPr>
               <w:t xml:space="preserve">Self-hosted Mermaid-to-PNG rendering, no outbound dependency</w:t>
             </w:r>
           </w:p>
@@ -1386,30 +2262,66 @@
       <w:tr>
         <w:tc>
           <w:tcPr>
-            <w:tcW w:type="dxa" w:w="2200"/>
-          </w:tcPr>
-          <w:p>
-            <w:r>
+            <w:tcW w:type="dxa" w:w="2080"/>
+            <w:tcMar>
+              <w:top w:type="dxa" w:w="100"/>
+              <w:left w:type="dxa" w:w="120"/>
+              <w:bottom w:type="dxa" w:w="100"/>
+              <w:right w:type="dxa" w:w="120"/>
+            </w:tcMar>
+          </w:tcPr>
+          <w:p>
+            <w:r>
+              <w:rPr>
+                <w:b w:val="false"/>
+                <w:bCs w:val="false"/>
+                <w:sz w:val="20"/>
+                <w:szCs w:val="20"/>
+              </w:rPr>
               <w:t xml:space="preserve">Validation</w:t>
             </w:r>
           </w:p>
         </w:tc>
         <w:tc>
           <w:tcPr>
-            <w:tcW w:type="dxa" w:w="2800"/>
-          </w:tcPr>
-          <w:p>
-            <w:r>
+            <w:tcW w:type="dxa" w:w="3120"/>
+            <w:tcMar>
+              <w:top w:type="dxa" w:w="100"/>
+              <w:left w:type="dxa" w:w="120"/>
+              <w:bottom w:type="dxa" w:w="100"/>
+              <w:right w:type="dxa" w:w="120"/>
+            </w:tcMar>
+          </w:tcPr>
+          <w:p>
+            <w:r>
+              <w:rPr>
+                <w:b w:val="false"/>
+                <w:bCs w:val="false"/>
+                <w:sz w:val="20"/>
+                <w:szCs w:val="20"/>
+              </w:rPr>
               <w:t xml:space="preserve">Pydantic v2</w:t>
             </w:r>
           </w:p>
         </w:tc>
         <w:tc>
           <w:tcPr>
-            <w:tcW w:type="dxa" w:w="4000"/>
-          </w:tcPr>
-          <w:p>
-            <w:r>
+            <w:tcW w:type="dxa" w:w="4160"/>
+            <w:tcMar>
+              <w:top w:type="dxa" w:w="100"/>
+              <w:left w:type="dxa" w:w="120"/>
+              <w:bottom w:type="dxa" w:w="100"/>
+              <w:right w:type="dxa" w:w="120"/>
+            </w:tcMar>
+          </w:tcPr>
+          <w:p>
+            <w:r>
+              <w:rPr>
+                <w:b w:val="false"/>
+                <w:bCs w:val="false"/>
+                <w:sz w:val="20"/>
+                <w:szCs w:val="20"/>
+              </w:rPr>
               <w:t xml:space="preserve">Structured output validation for all agent responses and tool I/O</w:t>
             </w:r>
           </w:p>
@@ -1418,30 +2330,66 @@
       <w:tr>
         <w:tc>
           <w:tcPr>
-            <w:tcW w:type="dxa" w:w="2200"/>
-          </w:tcPr>
-          <w:p>
-            <w:r>
+            <w:tcW w:type="dxa" w:w="2080"/>
+            <w:tcMar>
+              <w:top w:type="dxa" w:w="100"/>
+              <w:left w:type="dxa" w:w="120"/>
+              <w:bottom w:type="dxa" w:w="100"/>
+              <w:right w:type="dxa" w:w="120"/>
+            </w:tcMar>
+          </w:tcPr>
+          <w:p>
+            <w:r>
+              <w:rPr>
+                <w:b w:val="false"/>
+                <w:bCs w:val="false"/>
+                <w:sz w:val="20"/>
+                <w:szCs w:val="20"/>
+              </w:rPr>
               <w:t xml:space="preserve">Diff Engine</w:t>
             </w:r>
           </w:p>
         </w:tc>
         <w:tc>
           <w:tcPr>
-            <w:tcW w:type="dxa" w:w="2800"/>
-          </w:tcPr>
-          <w:p>
-            <w:r>
+            <w:tcW w:type="dxa" w:w="3120"/>
+            <w:tcMar>
+              <w:top w:type="dxa" w:w="100"/>
+              <w:left w:type="dxa" w:w="120"/>
+              <w:bottom w:type="dxa" w:w="100"/>
+              <w:right w:type="dxa" w:w="120"/>
+            </w:tcMar>
+          </w:tcPr>
+          <w:p>
+            <w:r>
+              <w:rPr>
+                <w:b w:val="false"/>
+                <w:bCs w:val="false"/>
+                <w:sz w:val="20"/>
+                <w:szCs w:val="20"/>
+              </w:rPr>
               <w:t xml:space="preserve">deepdiff</w:t>
             </w:r>
           </w:p>
         </w:tc>
         <w:tc>
           <w:tcPr>
-            <w:tcW w:type="dxa" w:w="4000"/>
-          </w:tcPr>
-          <w:p>
-            <w:r>
+            <w:tcW w:type="dxa" w:w="4160"/>
+            <w:tcMar>
+              <w:top w:type="dxa" w:w="100"/>
+              <w:left w:type="dxa" w:w="120"/>
+              <w:bottom w:type="dxa" w:w="100"/>
+              <w:right w:type="dxa" w:w="120"/>
+            </w:tcMar>
+          </w:tcPr>
+          <w:p>
+            <w:r>
+              <w:rPr>
+                <w:b w:val="false"/>
+                <w:bCs w:val="false"/>
+                <w:sz w:val="20"/>
+                <w:szCs w:val="20"/>
+              </w:rPr>
               <w:t xml:space="preserve">Semantic spec diff on Pydantic model_dump() to trigger ADR generation</w:t>
             </w:r>
           </w:p>
@@ -1450,30 +2398,66 @@
       <w:tr>
         <w:tc>
           <w:tcPr>
-            <w:tcW w:type="dxa" w:w="2200"/>
-          </w:tcPr>
-          <w:p>
-            <w:r>
+            <w:tcW w:type="dxa" w:w="2080"/>
+            <w:tcMar>
+              <w:top w:type="dxa" w:w="100"/>
+              <w:left w:type="dxa" w:w="120"/>
+              <w:bottom w:type="dxa" w:w="100"/>
+              <w:right w:type="dxa" w:w="120"/>
+            </w:tcMar>
+          </w:tcPr>
+          <w:p>
+            <w:r>
+              <w:rPr>
+                <w:b w:val="false"/>
+                <w:bCs w:val="false"/>
+                <w:sz w:val="20"/>
+                <w:szCs w:val="20"/>
+              </w:rPr>
               <w:t xml:space="preserve">Language</w:t>
             </w:r>
           </w:p>
         </w:tc>
         <w:tc>
           <w:tcPr>
-            <w:tcW w:type="dxa" w:w="2800"/>
-          </w:tcPr>
-          <w:p>
-            <w:r>
+            <w:tcW w:type="dxa" w:w="3120"/>
+            <w:tcMar>
+              <w:top w:type="dxa" w:w="100"/>
+              <w:left w:type="dxa" w:w="120"/>
+              <w:bottom w:type="dxa" w:w="100"/>
+              <w:right w:type="dxa" w:w="120"/>
+            </w:tcMar>
+          </w:tcPr>
+          <w:p>
+            <w:r>
+              <w:rPr>
+                <w:b w:val="false"/>
+                <w:bCs w:val="false"/>
+                <w:sz w:val="20"/>
+                <w:szCs w:val="20"/>
+              </w:rPr>
               <w:t xml:space="preserve">Python 3.11+ (Anaconda venv)</w:t>
             </w:r>
           </w:p>
         </w:tc>
         <w:tc>
           <w:tcPr>
-            <w:tcW w:type="dxa" w:w="4000"/>
-          </w:tcPr>
-          <w:p>
-            <w:r>
+            <w:tcW w:type="dxa" w:w="4160"/>
+            <w:tcMar>
+              <w:top w:type="dxa" w:w="100"/>
+              <w:left w:type="dxa" w:w="120"/>
+              <w:bottom w:type="dxa" w:w="100"/>
+              <w:right w:type="dxa" w:w="120"/>
+            </w:tcMar>
+          </w:tcPr>
+          <w:p>
+            <w:r>
+              <w:rPr>
+                <w:b w:val="false"/>
+                <w:bCs w:val="false"/>
+                <w:sz w:val="20"/>
+                <w:szCs w:val="20"/>
+              </w:rPr>
               <w:t xml:space="preserve">Solo developer, Python-first, no TypeScript or Go components</w:t>
             </w:r>
           </w:p>
@@ -1483,15 +2467,22 @@
     <w:p>
       <w:pPr>
         <w:pStyle w:val="Heading1"/>
-        <w:spacing w:after="150" w:before="300"/>
-      </w:pPr>
-      <w:r>
+        <w:spacing w:after="160" w:before="400"/>
+      </w:pPr>
+      <w:r>
+        <w:rPr>
+          <w:b/>
+          <w:bCs/>
+          <w:color w:val="2E5B4F"/>
+          <w:sz w:val="30"/>
+          <w:szCs w:val="30"/>
+        </w:rPr>
         <w:t xml:space="preserve">C4 Diagram Roadmap</w:t>
       </w:r>
     </w:p>
     <w:tbl>
       <w:tblPr>
-        <w:tblW w:type="dxa" w:w="9000"/>
+        <w:tblW w:type="dxa" w:w="9360"/>
         <w:tblBorders>
           <w:top w:val="single" w:color="auto" w:sz="4"/>
           <w:left w:val="single" w:color="auto" w:sz="4"/>
@@ -1502,22 +2493,33 @@
         </w:tblBorders>
       </w:tblPr>
       <w:tblGrid>
-        <w:gridCol w:w="1600"/>
-        <w:gridCol w:w="2200"/>
-        <w:gridCol w:w="3400"/>
-        <w:gridCol w:w="1800"/>
+        <w:gridCol w:w="1560"/>
+        <w:gridCol w:w="2080"/>
+        <w:gridCol w:w="3120"/>
+        <w:gridCol w:w="2600"/>
       </w:tblGrid>
       <w:tr>
-        <w:tc>
-          <w:tcPr>
-            <w:tcW w:type="dxa" w:w="1600"/>
-            <w:shd w:fill="D9D9D9" w:val="clear"/>
+        <w:trPr>
+          <w:tblHeader/>
+        </w:trPr>
+        <w:tc>
+          <w:tcPr>
+            <w:tcW w:type="dxa" w:w="1560"/>
+            <w:shd w:fill="EFEBE2" w:val="clear"/>
+            <w:tcMar>
+              <w:top w:type="dxa" w:w="100"/>
+              <w:left w:type="dxa" w:w="120"/>
+              <w:bottom w:type="dxa" w:w="100"/>
+              <w:right w:type="dxa" w:w="120"/>
+            </w:tcMar>
           </w:tcPr>
           <w:p>
             <w:r>
               <w:rPr>
                 <w:b/>
                 <w:bCs/>
+                <w:sz w:val="20"/>
+                <w:szCs w:val="20"/>
               </w:rPr>
               <w:t xml:space="preserve">Version</w:t>
             </w:r>
@@ -1525,14 +2527,22 @@
         </w:tc>
         <w:tc>
           <w:tcPr>
-            <w:tcW w:type="dxa" w:w="2200"/>
-            <w:shd w:fill="D9D9D9" w:val="clear"/>
+            <w:tcW w:type="dxa" w:w="2080"/>
+            <w:shd w:fill="EFEBE2" w:val="clear"/>
+            <w:tcMar>
+              <w:top w:type="dxa" w:w="100"/>
+              <w:left w:type="dxa" w:w="120"/>
+              <w:bottom w:type="dxa" w:w="100"/>
+              <w:right w:type="dxa" w:w="120"/>
+            </w:tcMar>
           </w:tcPr>
           <w:p>
             <w:r>
               <w:rPr>
                 <w:b/>
                 <w:bCs/>
+                <w:sz w:val="20"/>
+                <w:szCs w:val="20"/>
               </w:rPr>
               <w:t xml:space="preserve">C4 Level</w:t>
             </w:r>
@@ -1540,14 +2550,22 @@
         </w:tc>
         <w:tc>
           <w:tcPr>
-            <w:tcW w:type="dxa" w:w="3400"/>
-            <w:shd w:fill="D9D9D9" w:val="clear"/>
+            <w:tcW w:type="dxa" w:w="3120"/>
+            <w:shd w:fill="EFEBE2" w:val="clear"/>
+            <w:tcMar>
+              <w:top w:type="dxa" w:w="100"/>
+              <w:left w:type="dxa" w:w="120"/>
+              <w:bottom w:type="dxa" w:w="100"/>
+              <w:right w:type="dxa" w:w="120"/>
+            </w:tcMar>
           </w:tcPr>
           <w:p>
             <w:r>
               <w:rPr>
                 <w:b/>
                 <w:bCs/>
+                <w:sz w:val="20"/>
+                <w:szCs w:val="20"/>
               </w:rPr>
               <w:t xml:space="preserve">Diagram Type</w:t>
             </w:r>
@@ -1555,14 +2573,22 @@
         </w:tc>
         <w:tc>
           <w:tcPr>
-            <w:tcW w:type="dxa" w:w="1800"/>
-            <w:shd w:fill="D9D9D9" w:val="clear"/>
+            <w:tcW w:type="dxa" w:w="2600"/>
+            <w:shd w:fill="EFEBE2" w:val="clear"/>
+            <w:tcMar>
+              <w:top w:type="dxa" w:w="100"/>
+              <w:left w:type="dxa" w:w="120"/>
+              <w:bottom w:type="dxa" w:w="100"/>
+              <w:right w:type="dxa" w:w="120"/>
+            </w:tcMar>
           </w:tcPr>
           <w:p>
             <w:r>
               <w:rPr>
                 <w:b/>
                 <w:bCs/>
+                <w:sz w:val="20"/>
+                <w:szCs w:val="20"/>
               </w:rPr>
               <w:t xml:space="preserve">Audience</w:t>
             </w:r>
@@ -1572,40 +2598,88 @@
       <w:tr>
         <w:tc>
           <w:tcPr>
-            <w:tcW w:type="dxa" w:w="1600"/>
-          </w:tcPr>
-          <w:p>
-            <w:r>
+            <w:tcW w:type="dxa" w:w="1560"/>
+            <w:tcMar>
+              <w:top w:type="dxa" w:w="100"/>
+              <w:left w:type="dxa" w:w="120"/>
+              <w:bottom w:type="dxa" w:w="100"/>
+              <w:right w:type="dxa" w:w="120"/>
+            </w:tcMar>
+          </w:tcPr>
+          <w:p>
+            <w:r>
+              <w:rPr>
+                <w:b w:val="false"/>
+                <w:bCs w:val="false"/>
+                <w:sz w:val="20"/>
+                <w:szCs w:val="20"/>
+              </w:rPr>
               <w:t xml:space="preserve">MVP (v1)</w:t>
             </w:r>
           </w:p>
         </w:tc>
         <w:tc>
           <w:tcPr>
-            <w:tcW w:type="dxa" w:w="2200"/>
-          </w:tcPr>
-          <w:p>
-            <w:r>
+            <w:tcW w:type="dxa" w:w="2080"/>
+            <w:tcMar>
+              <w:top w:type="dxa" w:w="100"/>
+              <w:left w:type="dxa" w:w="120"/>
+              <w:bottom w:type="dxa" w:w="100"/>
+              <w:right w:type="dxa" w:w="120"/>
+            </w:tcMar>
+          </w:tcPr>
+          <w:p>
+            <w:r>
+              <w:rPr>
+                <w:b w:val="false"/>
+                <w:bCs w:val="false"/>
+                <w:sz w:val="20"/>
+                <w:szCs w:val="20"/>
+              </w:rPr>
               <w:t xml:space="preserve">L1: System Context</w:t>
             </w:r>
           </w:p>
         </w:tc>
         <w:tc>
           <w:tcPr>
-            <w:tcW w:type="dxa" w:w="3400"/>
-          </w:tcPr>
-          <w:p>
-            <w:r>
+            <w:tcW w:type="dxa" w:w="3120"/>
+            <w:tcMar>
+              <w:top w:type="dxa" w:w="100"/>
+              <w:left w:type="dxa" w:w="120"/>
+              <w:bottom w:type="dxa" w:w="100"/>
+              <w:right w:type="dxa" w:w="120"/>
+            </w:tcMar>
+          </w:tcPr>
+          <w:p>
+            <w:r>
+              <w:rPr>
+                <w:b w:val="false"/>
+                <w:bCs w:val="false"/>
+                <w:sz w:val="20"/>
+                <w:szCs w:val="20"/>
+              </w:rPr>
               <w:t xml:space="preserve">System + external actors and dependencies</w:t>
             </w:r>
           </w:p>
         </w:tc>
         <w:tc>
           <w:tcPr>
-            <w:tcW w:type="dxa" w:w="1800"/>
-          </w:tcPr>
-          <w:p>
-            <w:r>
+            <w:tcW w:type="dxa" w:w="2600"/>
+            <w:tcMar>
+              <w:top w:type="dxa" w:w="100"/>
+              <w:left w:type="dxa" w:w="120"/>
+              <w:bottom w:type="dxa" w:w="100"/>
+              <w:right w:type="dxa" w:w="120"/>
+            </w:tcMar>
+          </w:tcPr>
+          <w:p>
+            <w:r>
+              <w:rPr>
+                <w:b w:val="false"/>
+                <w:bCs w:val="false"/>
+                <w:sz w:val="20"/>
+                <w:szCs w:val="20"/>
+              </w:rPr>
               <w:t xml:space="preserve">Technical and non-technical stakeholders</w:t>
             </w:r>
           </w:p>
@@ -1614,40 +2688,88 @@
       <w:tr>
         <w:tc>
           <w:tcPr>
-            <w:tcW w:type="dxa" w:w="1600"/>
-          </w:tcPr>
-          <w:p>
-            <w:r>
+            <w:tcW w:type="dxa" w:w="1560"/>
+            <w:tcMar>
+              <w:top w:type="dxa" w:w="100"/>
+              <w:left w:type="dxa" w:w="120"/>
+              <w:bottom w:type="dxa" w:w="100"/>
+              <w:right w:type="dxa" w:w="120"/>
+            </w:tcMar>
+          </w:tcPr>
+          <w:p>
+            <w:r>
+              <w:rPr>
+                <w:b w:val="false"/>
+                <w:bCs w:val="false"/>
+                <w:sz w:val="20"/>
+                <w:szCs w:val="20"/>
+              </w:rPr>
               <w:t xml:space="preserve">v2</w:t>
             </w:r>
           </w:p>
         </w:tc>
         <w:tc>
           <w:tcPr>
-            <w:tcW w:type="dxa" w:w="2200"/>
-          </w:tcPr>
-          <w:p>
-            <w:r>
+            <w:tcW w:type="dxa" w:w="2080"/>
+            <w:tcMar>
+              <w:top w:type="dxa" w:w="100"/>
+              <w:left w:type="dxa" w:w="120"/>
+              <w:bottom w:type="dxa" w:w="100"/>
+              <w:right w:type="dxa" w:w="120"/>
+            </w:tcMar>
+          </w:tcPr>
+          <w:p>
+            <w:r>
+              <w:rPr>
+                <w:b w:val="false"/>
+                <w:bCs w:val="false"/>
+                <w:sz w:val="20"/>
+                <w:szCs w:val="20"/>
+              </w:rPr>
               <w:t xml:space="preserve">L2: Container</w:t>
             </w:r>
           </w:p>
         </w:tc>
         <w:tc>
           <w:tcPr>
-            <w:tcW w:type="dxa" w:w="3400"/>
-          </w:tcPr>
-          <w:p>
-            <w:r>
+            <w:tcW w:type="dxa" w:w="3120"/>
+            <w:tcMar>
+              <w:top w:type="dxa" w:w="100"/>
+              <w:left w:type="dxa" w:w="120"/>
+              <w:bottom w:type="dxa" w:w="100"/>
+              <w:right w:type="dxa" w:w="120"/>
+            </w:tcMar>
+          </w:tcPr>
+          <w:p>
+            <w:r>
+              <w:rPr>
+                <w:b w:val="false"/>
+                <w:bCs w:val="false"/>
+                <w:sz w:val="20"/>
+                <w:szCs w:val="20"/>
+              </w:rPr>
               <w:t xml:space="preserve">Internal containers: services, DBs, APIs, queues</w:t>
             </w:r>
           </w:p>
         </w:tc>
         <w:tc>
           <w:tcPr>
-            <w:tcW w:type="dxa" w:w="1800"/>
-          </w:tcPr>
-          <w:p>
-            <w:r>
+            <w:tcW w:type="dxa" w:w="2600"/>
+            <w:tcMar>
+              <w:top w:type="dxa" w:w="100"/>
+              <w:left w:type="dxa" w:w="120"/>
+              <w:bottom w:type="dxa" w:w="100"/>
+              <w:right w:type="dxa" w:w="120"/>
+            </w:tcMar>
+          </w:tcPr>
+          <w:p>
+            <w:r>
+              <w:rPr>
+                <w:b w:val="false"/>
+                <w:bCs w:val="false"/>
+                <w:sz w:val="20"/>
+                <w:szCs w:val="20"/>
+              </w:rPr>
               <w:t xml:space="preserve">Engineers and architects</w:t>
             </w:r>
           </w:p>
@@ -1656,40 +2778,88 @@
       <w:tr>
         <w:tc>
           <w:tcPr>
-            <w:tcW w:type="dxa" w:w="1600"/>
-          </w:tcPr>
-          <w:p>
-            <w:r>
+            <w:tcW w:type="dxa" w:w="1560"/>
+            <w:tcMar>
+              <w:top w:type="dxa" w:w="100"/>
+              <w:left w:type="dxa" w:w="120"/>
+              <w:bottom w:type="dxa" w:w="100"/>
+              <w:right w:type="dxa" w:w="120"/>
+            </w:tcMar>
+          </w:tcPr>
+          <w:p>
+            <w:r>
+              <w:rPr>
+                <w:b w:val="false"/>
+                <w:bCs w:val="false"/>
+                <w:sz w:val="20"/>
+                <w:szCs w:val="20"/>
+              </w:rPr>
               <w:t xml:space="preserve">v3</w:t>
             </w:r>
           </w:p>
         </w:tc>
         <w:tc>
           <w:tcPr>
-            <w:tcW w:type="dxa" w:w="2200"/>
-          </w:tcPr>
-          <w:p>
-            <w:r>
+            <w:tcW w:type="dxa" w:w="2080"/>
+            <w:tcMar>
+              <w:top w:type="dxa" w:w="100"/>
+              <w:left w:type="dxa" w:w="120"/>
+              <w:bottom w:type="dxa" w:w="100"/>
+              <w:right w:type="dxa" w:w="120"/>
+            </w:tcMar>
+          </w:tcPr>
+          <w:p>
+            <w:r>
+              <w:rPr>
+                <w:b w:val="false"/>
+                <w:bCs w:val="false"/>
+                <w:sz w:val="20"/>
+                <w:szCs w:val="20"/>
+              </w:rPr>
               <w:t xml:space="preserve">L3: Component</w:t>
             </w:r>
           </w:p>
         </w:tc>
         <w:tc>
           <w:tcPr>
-            <w:tcW w:type="dxa" w:w="3400"/>
-          </w:tcPr>
-          <w:p>
-            <w:r>
+            <w:tcW w:type="dxa" w:w="3120"/>
+            <w:tcMar>
+              <w:top w:type="dxa" w:w="100"/>
+              <w:left w:type="dxa" w:w="120"/>
+              <w:bottom w:type="dxa" w:w="100"/>
+              <w:right w:type="dxa" w:w="120"/>
+            </w:tcMar>
+          </w:tcPr>
+          <w:p>
+            <w:r>
+              <w:rPr>
+                <w:b w:val="false"/>
+                <w:bCs w:val="false"/>
+                <w:sz w:val="20"/>
+                <w:szCs w:val="20"/>
+              </w:rPr>
               <w:t xml:space="preserve">Internals of a selected container</w:t>
             </w:r>
           </w:p>
         </w:tc>
         <w:tc>
           <w:tcPr>
-            <w:tcW w:type="dxa" w:w="1800"/>
-          </w:tcPr>
-          <w:p>
-            <w:r>
+            <w:tcW w:type="dxa" w:w="2600"/>
+            <w:tcMar>
+              <w:top w:type="dxa" w:w="100"/>
+              <w:left w:type="dxa" w:w="120"/>
+              <w:bottom w:type="dxa" w:w="100"/>
+              <w:right w:type="dxa" w:w="120"/>
+            </w:tcMar>
+          </w:tcPr>
+          <w:p>
+            <w:r>
+              <w:rPr>
+                <w:b w:val="false"/>
+                <w:bCs w:val="false"/>
+                <w:sz w:val="20"/>
+                <w:szCs w:val="20"/>
+              </w:rPr>
               <w:t xml:space="preserve">Engineers</w:t>
             </w:r>
           </w:p>
@@ -1698,40 +2868,88 @@
       <w:tr>
         <w:tc>
           <w:tcPr>
-            <w:tcW w:type="dxa" w:w="1600"/>
-          </w:tcPr>
-          <w:p>
-            <w:r>
+            <w:tcW w:type="dxa" w:w="1560"/>
+            <w:tcMar>
+              <w:top w:type="dxa" w:w="100"/>
+              <w:left w:type="dxa" w:w="120"/>
+              <w:bottom w:type="dxa" w:w="100"/>
+              <w:right w:type="dxa" w:w="120"/>
+            </w:tcMar>
+          </w:tcPr>
+          <w:p>
+            <w:r>
+              <w:rPr>
+                <w:b w:val="false"/>
+                <w:bCs w:val="false"/>
+                <w:sz w:val="20"/>
+                <w:szCs w:val="20"/>
+              </w:rPr>
               <w:t xml:space="preserve">Out of scope</w:t>
             </w:r>
           </w:p>
         </w:tc>
         <w:tc>
           <w:tcPr>
-            <w:tcW w:type="dxa" w:w="2200"/>
-          </w:tcPr>
-          <w:p>
-            <w:r>
+            <w:tcW w:type="dxa" w:w="2080"/>
+            <w:tcMar>
+              <w:top w:type="dxa" w:w="100"/>
+              <w:left w:type="dxa" w:w="120"/>
+              <w:bottom w:type="dxa" w:w="100"/>
+              <w:right w:type="dxa" w:w="120"/>
+            </w:tcMar>
+          </w:tcPr>
+          <w:p>
+            <w:r>
+              <w:rPr>
+                <w:b w:val="false"/>
+                <w:bCs w:val="false"/>
+                <w:sz w:val="20"/>
+                <w:szCs w:val="20"/>
+              </w:rPr>
               <w:t xml:space="preserve">L4: Code</w:t>
             </w:r>
           </w:p>
         </w:tc>
         <w:tc>
           <w:tcPr>
-            <w:tcW w:type="dxa" w:w="3400"/>
-          </w:tcPr>
-          <w:p>
-            <w:r>
+            <w:tcW w:type="dxa" w:w="3120"/>
+            <w:tcMar>
+              <w:top w:type="dxa" w:w="100"/>
+              <w:left w:type="dxa" w:w="120"/>
+              <w:bottom w:type="dxa" w:w="100"/>
+              <w:right w:type="dxa" w:w="120"/>
+            </w:tcMar>
+          </w:tcPr>
+          <w:p>
+            <w:r>
+              <w:rPr>
+                <w:b w:val="false"/>
+                <w:bCs w:val="false"/>
+                <w:sz w:val="20"/>
+                <w:szCs w:val="20"/>
+              </w:rPr>
               <w:t xml:space="preserve">Class / implementation level</w:t>
             </w:r>
           </w:p>
         </w:tc>
         <w:tc>
           <w:tcPr>
-            <w:tcW w:type="dxa" w:w="1800"/>
-          </w:tcPr>
-          <w:p>
-            <w:r>
+            <w:tcW w:type="dxa" w:w="2600"/>
+            <w:tcMar>
+              <w:top w:type="dxa" w:w="100"/>
+              <w:left w:type="dxa" w:w="120"/>
+              <w:bottom w:type="dxa" w:w="100"/>
+              <w:right w:type="dxa" w:w="120"/>
+            </w:tcMar>
+          </w:tcPr>
+          <w:p>
+            <w:r>
+              <w:rPr>
+                <w:b w:val="false"/>
+                <w:bCs w:val="false"/>
+                <w:sz w:val="20"/>
+                <w:szCs w:val="20"/>
+              </w:rPr>
               <w:t xml:space="preserve">n/a</w:t>
             </w:r>
           </w:p>
@@ -1741,9 +2959,16 @@
     <w:p>
       <w:pPr>
         <w:pStyle w:val="Heading1"/>
-        <w:spacing w:after="150" w:before="300"/>
-      </w:pPr>
-      <w:r>
+        <w:spacing w:after="160" w:before="400"/>
+      </w:pPr>
+      <w:r>
+        <w:rPr>
+          <w:b/>
+          <w:bCs/>
+          <w:color w:val="2E5B4F"/>
+          <w:sz w:val="30"/>
+          <w:szCs w:val="30"/>
+        </w:rPr>
         <w:t xml:space="preserve">What Is Novel</w:t>
       </w:r>
     </w:p>
@@ -1752,11 +2977,15 @@
         <w:pStyle w:val="ListParagraph"/>
         <w:numPr>
           <w:ilvl w:val="0"/>
-          <w:numId w:val="1"/>
+          <w:numId w:val="2"/>
         </w:numPr>
-        <w:spacing w:after="80"/>
-      </w:pPr>
-      <w:r>
+        <w:spacing w:after="100"/>
+      </w:pPr>
+      <w:r>
+        <w:rPr>
+          <w:sz w:val="21"/>
+          <w:szCs w:val="21"/>
+        </w:rPr>
         <w:t xml:space="preserve">No public benchmarks exist for AI-assisted software architecture design or ADR generation, a 2026 survey of LLM benchmarks across the software development lifecycle found no public benchmarks for architectural design. The field is almost entirely code-generation focused.</w:t>
       </w:r>
     </w:p>
@@ -1765,11 +2994,15 @@
         <w:pStyle w:val="ListParagraph"/>
         <w:numPr>
           <w:ilvl w:val="0"/>
-          <w:numId w:val="1"/>
+          <w:numId w:val="2"/>
         </w:numPr>
-        <w:spacing w:after="80"/>
-      </w:pPr>
-      <w:r>
+        <w:spacing w:after="100"/>
+      </w:pPr>
+      <w:r>
+        <w:rPr>
+          <w:sz w:val="21"/>
+          <w:szCs w:val="21"/>
+        </w:rPr>
         <w:t xml:space="preserve">The few papers on C4 or ADR generation (2025–2026) treat it as a single-turn task. This is a spec-driven multi-agent pipeline with human-in-the-loop approval and iterative revision.</w:t>
       </w:r>
     </w:p>
@@ -1778,11 +3011,15 @@
         <w:pStyle w:val="ListParagraph"/>
         <w:numPr>
           <w:ilvl w:val="0"/>
-          <w:numId w:val="1"/>
+          <w:numId w:val="2"/>
         </w:numPr>
-        <w:spacing w:after="80"/>
-      </w:pPr>
-      <w:r>
+        <w:spacing w:after="100"/>
+      </w:pPr>
+      <w:r>
+        <w:rPr>
+          <w:sz w:val="21"/>
+          <w:szCs w:val="21"/>
+        </w:rPr>
         <w:t xml:space="preserve">No existing tool combines C4 diagram generation, automatic ADR triggering on spec diffs, devil's advocate critique, quality metric scoring, and human approval, all within a single local pipeline with no cloud dependency.</w:t>
       </w:r>
     </w:p>
@@ -1791,38 +3028,67 @@
         <w:pStyle w:val="ListParagraph"/>
         <w:numPr>
           <w:ilvl w:val="0"/>
-          <w:numId w:val="1"/>
+          <w:numId w:val="2"/>
         </w:numPr>
-        <w:spacing w:after="80"/>
-      </w:pPr>
-      <w:r>
+        <w:spacing w:after="100"/>
+      </w:pPr>
+      <w:r>
+        <w:rPr>
+          <w:sz w:val="21"/>
+          <w:szCs w:val="21"/>
+        </w:rPr>
         <w:t xml:space="preserve">Running this class of architecture reasoning pipeline on CPU-only edge hardware with SLMs challenges the assumption that frontier models and cloud APIs are required.</w:t>
       </w:r>
     </w:p>
     <w:p>
       <w:pPr>
         <w:pStyle w:val="Heading1"/>
-        <w:spacing w:after="150" w:before="300"/>
-      </w:pPr>
-      <w:r>
+        <w:spacing w:after="160" w:before="400"/>
+      </w:pPr>
+      <w:r>
+        <w:rPr>
+          <w:b/>
+          <w:bCs/>
+          <w:color w:val="2E5B4F"/>
+          <w:sz w:val="30"/>
+          <w:szCs w:val="30"/>
+        </w:rPr>
         <w:t xml:space="preserve">Positioning</w:t>
       </w:r>
     </w:p>
     <w:p>
       <w:pPr>
-        <w:spacing w:after="200"/>
+        <w:spacing w:after="120"/>
       </w:pPr>
       <w:r>
         <w:rPr>
           <w:i/>
           <w:iCs/>
+          <w:sz w:val="21"/>
+          <w:szCs w:val="21"/>
         </w:rPr>
         <w:t xml:space="preserve">Agent Swarm at the Edge is not an AI that replaces architects. It is a discipline scaffold that makes C4 + ADR practice accessible and sustainable for solo engineers and small teams who know the practice matters but cannot sustain it without tooling support, running entirely on their own hardware, with their architecture specs never leaving their machine.</w:t>
       </w:r>
     </w:p>
     <w:p>
-      <w:r>
-        <w:t xml:space="preserve">Agent Swarm at the Edge · v0.7 · July 2026 · Max</w:t>
+      <w:pPr>
+        <w:pBdr>
+          <w:bottom w:val="single" w:color="C9C2B5" w:sz="6" w:space="4"/>
+        </w:pBdr>
+        <w:spacing w:after="200" w:before="100"/>
+      </w:pPr>
+    </w:p>
+    <w:p>
+      <w:pPr>
+        <w:spacing w:after="160"/>
+      </w:pPr>
+      <w:r>
+        <w:rPr>
+          <w:color w:val="888888"/>
+          <w:sz w:val="18"/>
+          <w:szCs w:val="18"/>
+        </w:rPr>
+        <w:t xml:space="preserve">Agent Swarm at the Edge · v0.8 · July 2026 · Max</w:t>
       </w:r>
     </w:p>
     <w:sectPr>
@@ -1999,8 +3265,26 @@
       </w:pPr>
     </w:lvl>
   </w:abstractNum>
+  <w:abstractNum w:abstractNumId="2" w15:restartNumberingAfterBreak="0">
+    <w:multiLevelType w:val="hybridMultilevel"/>
+    <w:lvl w:ilvl="0" w15:tentative="1">
+      <w:start w:val="1"/>
+      <w:numFmt w:val="bullet"/>
+      <w:lvlText w:val="•"/>
+      <w:lvlJc w:val="left"/>
+      <w:pPr>
+        <w:ind w:left="360" w:hanging="260"/>
+      </w:pPr>
+    </w:lvl>
+  </w:abstractNum>
   <w:num w:numId="1">
     <w:abstractNumId w:val="1"/>
+    <w:lvlOverride w:ilvl="0">
+      <w:startOverride w:val="1"/>
+    </w:lvlOverride>
+  </w:num>
+  <w:num w:numId="2">
+    <w:abstractNumId w:val="2"/>
     <w:lvlOverride w:ilvl="0">
       <w:startOverride w:val="1"/>
     </w:lvlOverride>

</xml_diff>

<commit_message>
docs: Updated the documentation to v10 with status on what is done.
</commit_message>
<xml_diff>
--- a/docs/agent_swarm_at_the_edge_public.docx
+++ b/docs/agent_swarm_at_the_edge_public.docx
@@ -42,7 +42,7 @@
           <w:i/>
           <w:iCs/>
         </w:rPr>
-        <w:t>Version 0.9: MVP Scoped to L1 System Context Diagram</w:t>
+        <w:t>Version 0.10: MVP Scoped to L1 System Context Diagram</w:t>
       </w:r>
     </w:p>
     <w:p>
@@ -56,7 +56,7 @@
           <w:i/>
           <w:iCs/>
         </w:rPr>
-        <w:t>15 July 2026 · Max · On-premise / Edge</w:t>
+        <w:t>24 July 2026 · Max · On-premise / Edge</w:t>
       </w:r>
     </w:p>
     <w:tbl>
@@ -1429,7 +1429,7 @@
       </w:pPr>
       <w:r>
         <w:rPr/>
-        <w:t>Reject → comments written as revision notes to the blackboard → pipeline re-runs from Critic</w:t>
+        <w:t>Reject → comments written as revision notes, persisted for the record → engineer revises the spec and re-submits (automatic re-run from Critic is a planned v2 improvement)</w:t>
       </w:r>
     </w:p>
     <w:p>
@@ -3243,25 +3243,7 @@
           <w:sz w:val="18"/>
           <w:szCs w:val="18"/>
         </w:rPr>
-        <w:t>Agent Swarm at the Edge · v0.</w:t>
-      </w:r>
-      <w:r>
-        <w:rPr>
-          <w:i/>
-          <w:iCs/>
-          <w:sz w:val="18"/>
-          <w:szCs w:val="18"/>
-        </w:rPr>
-        <w:t>9</w:t>
-      </w:r>
-      <w:r>
-        <w:rPr>
-          <w:i/>
-          <w:iCs/>
-          <w:sz w:val="18"/>
-          <w:szCs w:val="18"/>
-        </w:rPr>
-        <w:t xml:space="preserve"> · July 2026 · Max</w:t>
+        <w:t xml:space="preserve">Agent Swarm at the Edge · v0.10 · July 2026 · Max</w:t>
       </w:r>
     </w:p>
     <w:sectPr>

</xml_diff>

<commit_message>
docs: Updated to v12 which changes.
</commit_message>
<xml_diff>
--- a/docs/agent_swarm_at_the_edge_public.docx
+++ b/docs/agent_swarm_at_the_edge_public.docx
@@ -31,7 +31,7 @@
           <w:iCs/>
           <w:i/>
         </w:rPr>
-        <w:t xml:space="preserve">Version 0.11: MVP Scoped to L1 System Context Diagram</w:t>
+        <w:t xml:space="preserve">Version 0.12: First Approved Run — Paper Trail Closed</w:t>
       </w:r>
     </w:p>
     <w:p>
@@ -43,7 +43,7 @@
           <w:iCs/>
           <w:i/>
         </w:rPr>
-        <w:t xml:space="preserve">6 August 2026 · Max · On-premise / Edge</w:t>
+        <w:t xml:space="preserve">28 August 2026 · Max · On-premise / Edge</w:t>
       </w:r>
     </w:p>
     <w:tbl>
@@ -169,6 +169,14 @@
       </w:pPr>
       <w:r>
         <w:t xml:space="preserve">The output of one pipeline run: a C4 System Context diagram in Mermaid, an Architecture Decision Record triggered by any spec change, a structured gap critique, and a set of scored quality metrics, all requiring human approval before anything is persisted.</w:t>
+      </w:r>
+    </w:p>
+    <w:p>
+      <w:pPr>
+        <w:pStyle w:val="BodyText"/>
+      </w:pPr>
+      <w:r>
+        <w:t xml:space="preserve">As of late August 2026, the pipeline has run this loop end to end on real hardware: a spec went in, all five agents ran in sequence, a human reviewed the output, and an approved diagram and ADR were written to a versioned, git-committed artifact store. Not a demo script, an actual run.</w:t>
       </w:r>
     </w:p>
     <w:bookmarkEnd w:id="20"/>
@@ -1825,7 +1833,7 @@
           <w:iCs/>
           <w:i/>
         </w:rPr>
-        <w:t xml:space="preserve">Agent Swarm at the Edge · v0.11 · August 2026 · Max</w:t>
+        <w:t xml:space="preserve">Agent Swarm at the Edge · v0.12 · August 2026 · Max</w:t>
       </w:r>
     </w:p>
     <w:bookmarkEnd w:id="33"/>

</xml_diff>

<commit_message>
docs: Updated to v13 for the latest changes done to the project.
</commit_message>
<xml_diff>
--- a/docs/agent_swarm_at_the_edge_public.docx
+++ b/docs/agent_swarm_at_the_edge_public.docx
@@ -31,7 +31,7 @@
           <w:iCs/>
           <w:i/>
         </w:rPr>
-        <w:t xml:space="preserve">Version 0.12: First Approved Run — Paper Trail Closed</w:t>
+        <w:t xml:space="preserve">Version 0.13: Per-Agent Observability Live</w:t>
       </w:r>
     </w:p>
     <w:p>
@@ -43,7 +43,7 @@
           <w:iCs/>
           <w:i/>
         </w:rPr>
-        <w:t xml:space="preserve">28 August 2026 · Max · On-premise / Edge</w:t>
+        <w:t xml:space="preserve">31 August 2026 · Max · On-premise / Edge</w:t>
       </w:r>
     </w:p>
     <w:tbl>
@@ -179,6 +179,14 @@
         <w:t xml:space="preserve">As of late August 2026, the pipeline has run this loop end to end on real hardware: a spec went in, all five agents ran in sequence, a human reviewed the output, and an approved diagram and ADR were written to a versioned, git-committed artifact store. Not a demo script, an actual run.</w:t>
       </w:r>
     </w:p>
+    <w:p>
+      <w:pPr>
+        <w:pStyle w:val="BodyText"/>
+      </w:pPr>
+      <w:r>
+        <w:t xml:space="preserve">As of 31 August 2026, four of the five agents emit real per-agent traces to Arize Phoenix, confirmed via live pipeline runs.</w:t>
+      </w:r>
+    </w:p>
     <w:bookmarkEnd w:id="20"/>
     <w:bookmarkStart w:id="22" w:name="the-problem"/>
     <w:p>
@@ -540,19 +548,7 @@
               <w:jc w:val="left"/>
             </w:pPr>
             <w:r>
-              <w:t xml:space="preserve">Ubuntu 26.04 LTS</w:t>
-            </w:r>
-            <w:r>
-              <w:t xml:space="preserve"> </w:t>
-            </w:r>
-            <w:r>
-              <w:t xml:space="preserve">“</w:t>
-            </w:r>
-            <w:r>
-              <w:t xml:space="preserve">resolute</w:t>
-            </w:r>
-            <w:r>
-              <w:t xml:space="preserve">”</w:t>
+              <w:t xml:space="preserve">Ubuntu 26.04 LTS “resolute”</w:t>
             </w:r>
           </w:p>
         </w:tc>
@@ -1833,7 +1829,7 @@
           <w:iCs/>
           <w:i/>
         </w:rPr>
-        <w:t xml:space="preserve">Agent Swarm at the Edge · v0.12 · August 2026 · Max</w:t>
+        <w:t xml:space="preserve">Agent Swarm at the Edge · v0.13 · August 2026 · Max</w:t>
       </w:r>
     </w:p>
     <w:bookmarkEnd w:id="33"/>

</xml_diff>